<commit_message>
Day 9: Nested serializers + download_url field, added Swagger docs early
</commit_message>
<xml_diff>
--- a/docs/learning.docx
+++ b/docs/learning.docx
@@ -3355,6 +3355,36 @@
       </w:r>
       <w:r>
         <w:t>, saving development time on basic data management.</w:t>
+      </w:r>
+    </w:p>
+    <w:p>
+      <w:r>
+        <w:t xml:space="preserve">Whenever you want a field to </w:t>
+      </w:r>
+      <w:r>
+        <w:t>return to</w:t>
+      </w:r>
+      <w:r>
+        <w:t xml:space="preserve"> a field which is not present in database and you will calculate the data for that field </w:t>
+      </w:r>
+      <w:r>
+        <w:t>custom</w:t>
+      </w:r>
+      <w:r>
+        <w:t xml:space="preserve"> you can use serializer method in Django which is the most popular way for doing such type of tasks.</w:t>
+      </w:r>
+    </w:p>
+    <w:p>
+      <w:r>
+        <w:t>In source agreement we tell the DRF where to get the data in simple words we can say that take the value or attribute from another field</w:t>
+      </w:r>
+      <w:r>
+        <w:t>.</w:t>
+      </w:r>
+    </w:p>
+    <w:p>
+      <w:r>
+        <w:t>Serializer Method is a field which is not present in database but we create it manually using our custom logic written in serializer method.</w:t>
       </w:r>
     </w:p>
     <w:p/>
@@ -7248,6 +7278,7 @@
   <w:style w:type="character" w:default="1" w:styleId="DefaultParagraphFont">
     <w:name w:val="Default Paragraph Font"/>
     <w:uiPriority w:val="1"/>
+    <w:semiHidden/>
     <w:unhideWhenUsed/>
   </w:style>
   <w:style w:type="table" w:default="1" w:styleId="TableNormal">

</xml_diff>

<commit_message>
Day 10: Converted to ModelViewSet + DefaultRouter for full CRUD
</commit_message>
<xml_diff>
--- a/docs/learning.docx
+++ b/docs/learning.docx
@@ -69,7 +69,15 @@
     </w:p>
     <w:p>
       <w:r>
-        <w:t>Compared to the python-dotenv package, python-decouple provides better support for data type conversion.</w:t>
+        <w:t>Compared to the python-</w:t>
+      </w:r>
+      <w:proofErr w:type="spellStart"/>
+      <w:r>
+        <w:t>dotenv</w:t>
+      </w:r>
+      <w:proofErr w:type="spellEnd"/>
+      <w:r>
+        <w:t xml:space="preserve"> package, python-decouple provides better support for data type conversion.</w:t>
       </w:r>
     </w:p>
     <w:p>
@@ -190,7 +198,15 @@
         </w:numPr>
       </w:pPr>
       <w:r>
-        <w:t>python-dotenv is often sufficient.</w:t>
+        <w:t>python-</w:t>
+      </w:r>
+      <w:proofErr w:type="spellStart"/>
+      <w:r>
+        <w:t>dotenv</w:t>
+      </w:r>
+      <w:proofErr w:type="spellEnd"/>
+      <w:r>
+        <w:t xml:space="preserve"> is often sufficient.</w:t>
       </w:r>
     </w:p>
     <w:p>
@@ -205,7 +221,23 @@
           <w:b/>
           <w:bCs/>
         </w:rPr>
-        <w:t>Web frameworks (Django, Flask, FastAPI):</w:t>
+        <w:t xml:space="preserve">Web frameworks (Django, Flask, </w:t>
+      </w:r>
+      <w:proofErr w:type="spellStart"/>
+      <w:r>
+        <w:rPr>
+          <w:b/>
+          <w:bCs/>
+        </w:rPr>
+        <w:t>FastAPI</w:t>
+      </w:r>
+      <w:proofErr w:type="spellEnd"/>
+      <w:r>
+        <w:rPr>
+          <w:b/>
+          <w:bCs/>
+        </w:rPr>
+        <w:t>):</w:t>
       </w:r>
     </w:p>
     <w:p>
@@ -493,8 +525,21 @@
     </w:p>
     <w:p>
       <w:r>
-        <w:t>python manage.py startapp app_name</w:t>
-      </w:r>
+        <w:t xml:space="preserve">python manage.py </w:t>
+      </w:r>
+      <w:proofErr w:type="spellStart"/>
+      <w:r>
+        <w:t>startapp</w:t>
+      </w:r>
+      <w:proofErr w:type="spellEnd"/>
+      <w:r>
+        <w:t xml:space="preserve"> </w:t>
+      </w:r>
+      <w:proofErr w:type="spellStart"/>
+      <w:r>
+        <w:t>app_name</w:t>
+      </w:r>
+      <w:proofErr w:type="spellEnd"/>
     </w:p>
     <w:p>
       <w:r>
@@ -503,7 +548,15 @@
     </w:p>
     <w:p>
       <w:r>
-        <w:t>python manage.py startapp accounts</w:t>
+        <w:t xml:space="preserve">python manage.py </w:t>
+      </w:r>
+      <w:proofErr w:type="spellStart"/>
+      <w:r>
+        <w:t>startapp</w:t>
+      </w:r>
+      <w:proofErr w:type="spellEnd"/>
+      <w:r>
+        <w:t xml:space="preserve"> accounts</w:t>
       </w:r>
     </w:p>
     <w:p>
@@ -674,7 +727,15 @@
     </w:p>
     <w:p>
       <w:r>
-        <w:t>Create App (startapp)</w:t>
+        <w:t>Create App (</w:t>
+      </w:r>
+      <w:proofErr w:type="spellStart"/>
+      <w:r>
+        <w:t>startapp</w:t>
+      </w:r>
+      <w:proofErr w:type="spellEnd"/>
+      <w:r>
+        <w:t>)</w:t>
       </w:r>
     </w:p>
     <w:p>
@@ -714,8 +775,13 @@
     </w:p>
     <w:p>
       <w:r>
-        <w:t>Run makemigrations</w:t>
-      </w:r>
+        <w:t xml:space="preserve">Run </w:t>
+      </w:r>
+      <w:proofErr w:type="spellStart"/>
+      <w:r>
+        <w:t>makemigrations</w:t>
+      </w:r>
+      <w:proofErr w:type="spellEnd"/>
     </w:p>
     <w:p>
       <w:r>
@@ -816,12 +882,25 @@
     </w:p>
     <w:p>
       <w:r>
-        <w:t>Instead of creating everything from scratch, Django provides AbstractUser.</w:t>
-      </w:r>
-    </w:p>
-    <w:p>
-      <w:r>
-        <w:t>AbstractUser is a base class that contains all the fields and functionality of Django's default User model. By inheriting from it, you can easily add your own custom fields while keeping Django's authentication system.</w:t>
+        <w:t xml:space="preserve">Instead of creating everything from scratch, Django provides </w:t>
+      </w:r>
+      <w:proofErr w:type="spellStart"/>
+      <w:r>
+        <w:t>AbstractUser</w:t>
+      </w:r>
+      <w:proofErr w:type="spellEnd"/>
+      <w:r>
+        <w:t>.</w:t>
+      </w:r>
+    </w:p>
+    <w:p>
+      <w:proofErr w:type="spellStart"/>
+      <w:r>
+        <w:t>AbstractUser</w:t>
+      </w:r>
+      <w:proofErr w:type="spellEnd"/>
+      <w:r>
+        <w:t xml:space="preserve"> is a base class that contains all the fields and functionality of Django's default User model. By inheriting from it, you can easily add your own custom fields while keeping Django's authentication system.</w:t>
       </w:r>
     </w:p>
     <w:p>
@@ -915,9 +994,11 @@
           <w:numId w:val="7"/>
         </w:numPr>
       </w:pPr>
+      <w:proofErr w:type="spellStart"/>
       <w:r>
         <w:t>djangorestframework</w:t>
       </w:r>
+      <w:proofErr w:type="spellEnd"/>
     </w:p>
     <w:p>
       <w:pPr>
@@ -926,8 +1007,21 @@
           <w:numId w:val="7"/>
         </w:numPr>
       </w:pPr>
-      <w:r>
-        <w:t>django-cors-headers</w:t>
+      <w:proofErr w:type="spellStart"/>
+      <w:r>
+        <w:t>django</w:t>
+      </w:r>
+      <w:proofErr w:type="spellEnd"/>
+      <w:r>
+        <w:t>-</w:t>
+      </w:r>
+      <w:proofErr w:type="spellStart"/>
+      <w:r>
+        <w:t>cors</w:t>
+      </w:r>
+      <w:proofErr w:type="spellEnd"/>
+      <w:r>
+        <w:t>-headers</w:t>
       </w:r>
     </w:p>
     <w:p>
@@ -937,9 +1031,11 @@
           <w:numId w:val="7"/>
         </w:numPr>
       </w:pPr>
+      <w:proofErr w:type="spellStart"/>
       <w:r>
         <w:t>django-allauth</w:t>
       </w:r>
+      <w:proofErr w:type="spellEnd"/>
     </w:p>
     <w:p>
       <w:r>
@@ -975,8 +1071,21 @@
     </w:p>
     <w:p>
       <w:r>
-        <w:t>python manage.py startapp app_name</w:t>
-      </w:r>
+        <w:t xml:space="preserve">python manage.py </w:t>
+      </w:r>
+      <w:proofErr w:type="spellStart"/>
+      <w:r>
+        <w:t>startapp</w:t>
+      </w:r>
+      <w:proofErr w:type="spellEnd"/>
+      <w:r>
+        <w:t xml:space="preserve"> </w:t>
+      </w:r>
+      <w:proofErr w:type="spellStart"/>
+      <w:r>
+        <w:t>app_name</w:t>
+      </w:r>
+      <w:proofErr w:type="spellEnd"/>
     </w:p>
     <w:p>
       <w:r>
@@ -1024,7 +1133,15 @@
     </w:p>
     <w:p>
       <w:r>
-        <w:t xml:space="preserve">When we create a django local app these are the files which comes in this local app </w:t>
+        <w:t xml:space="preserve">When we create a </w:t>
+      </w:r>
+      <w:proofErr w:type="spellStart"/>
+      <w:r>
+        <w:t>django</w:t>
+      </w:r>
+      <w:proofErr w:type="spellEnd"/>
+      <w:r>
+        <w:t xml:space="preserve"> local app these are the files which comes in this local app </w:t>
       </w:r>
       <w:r>
         <w:t>admin.py apps.py models.py test.py views.py if you register a model and you want that this model should be shown only in admin panel then you write that code</w:t>
@@ -1238,8 +1355,29 @@
       </w:r>
     </w:p>
     <w:p>
-      <w:r>
-        <w:t>Contrib stands for django contributed applications this is a built in apps collection in django which are commonly used in web</w:t>
+      <w:proofErr w:type="spellStart"/>
+      <w:r>
+        <w:t>Contrib</w:t>
+      </w:r>
+      <w:proofErr w:type="spellEnd"/>
+      <w:r>
+        <w:t xml:space="preserve"> stands for </w:t>
+      </w:r>
+      <w:proofErr w:type="spellStart"/>
+      <w:r>
+        <w:t>django</w:t>
+      </w:r>
+      <w:proofErr w:type="spellEnd"/>
+      <w:r>
+        <w:t xml:space="preserve"> contributed applications this is a built in apps collection in </w:t>
+      </w:r>
+      <w:proofErr w:type="spellStart"/>
+      <w:r>
+        <w:t>django</w:t>
+      </w:r>
+      <w:proofErr w:type="spellEnd"/>
+      <w:r>
+        <w:t xml:space="preserve"> which are commonly used in web</w:t>
       </w:r>
     </w:p>
     <w:p>
@@ -1469,10 +1607,12 @@
             <w:hideMark/>
           </w:tcPr>
           <w:p>
+            <w:proofErr w:type="spellStart"/>
             <w:r>
               <w:lastRenderedPageBreak/>
               <w:t>staticfiles</w:t>
             </w:r>
+            <w:proofErr w:type="spellEnd"/>
           </w:p>
         </w:tc>
         <w:tc>
@@ -1557,9 +1697,11 @@
             <w:hideMark/>
           </w:tcPr>
           <w:p>
+            <w:proofErr w:type="spellStart"/>
             <w:r>
               <w:t>postgres</w:t>
             </w:r>
+            <w:proofErr w:type="spellEnd"/>
           </w:p>
         </w:tc>
         <w:tc>
@@ -1583,17 +1725,34 @@
           <w:bCs/>
         </w:rPr>
       </w:pPr>
-      <w:r>
-        <w:rPr>
-          <w:b/>
-          <w:bCs/>
-        </w:rPr>
-        <w:t>makemigrations:</w:t>
-      </w:r>
-    </w:p>
-    <w:p>
-      <w:r>
-        <w:t>The makemigrations command tells Django what changes have been made to the models and generates a migration file for those changes.</w:t>
+      <w:proofErr w:type="spellStart"/>
+      <w:r>
+        <w:rPr>
+          <w:b/>
+          <w:bCs/>
+        </w:rPr>
+        <w:t>makemigrations</w:t>
+      </w:r>
+      <w:proofErr w:type="spellEnd"/>
+      <w:r>
+        <w:rPr>
+          <w:b/>
+          <w:bCs/>
+        </w:rPr>
+        <w:t>:</w:t>
+      </w:r>
+    </w:p>
+    <w:p>
+      <w:r>
+        <w:t xml:space="preserve">The </w:t>
+      </w:r>
+      <w:proofErr w:type="spellStart"/>
+      <w:r>
+        <w:t>makemigrations</w:t>
+      </w:r>
+      <w:proofErr w:type="spellEnd"/>
+      <w:r>
+        <w:t xml:space="preserve"> command tells Django what changes have been made to the models and generates a migration file for those changes.</w:t>
       </w:r>
     </w:p>
     <w:p>
@@ -2029,7 +2188,15 @@
     </w:p>
     <w:p>
       <w:r>
-        <w:t>In Django when a user uploads a file so in order to handle user uploads means every time user upload the file the data base does not store the file content it just store the file path or link because if database store the content of the file then it becomes heavy that’s why we use file uploads in djnago on the other hand while taking data from user if we want that user cannot enter a custom choice rather than user will select the field from the fields which we have provided to him.</w:t>
+        <w:t xml:space="preserve">In Django when a user uploads a file so in order to handle user uploads means every time user upload the file the data base does not store the file content it just store the file path or link because if database store the content of the file then it becomes heavy that’s why we use file uploads in </w:t>
+      </w:r>
+      <w:proofErr w:type="spellStart"/>
+      <w:r>
+        <w:t>djnago</w:t>
+      </w:r>
+      <w:proofErr w:type="spellEnd"/>
+      <w:r>
+        <w:t xml:space="preserve"> on the other hand while taking data from user if we want that user cannot enter a custom choice rather than user will select the field from the fields which we have provided to him.</w:t>
       </w:r>
     </w:p>
     <w:p>
@@ -2380,12 +2547,28 @@
     </w:p>
     <w:p>
       <w:r>
-        <w:t xml:space="preserve">  "alg": "HS256",</w:t>
-      </w:r>
-    </w:p>
-    <w:p>
-      <w:r>
-        <w:t xml:space="preserve">  "typ": "JWT"</w:t>
+        <w:t xml:space="preserve">  "</w:t>
+      </w:r>
+      <w:proofErr w:type="spellStart"/>
+      <w:r>
+        <w:t>alg</w:t>
+      </w:r>
+      <w:proofErr w:type="spellEnd"/>
+      <w:r>
+        <w:t>": "HS256",</w:t>
+      </w:r>
+    </w:p>
+    <w:p>
+      <w:r>
+        <w:t xml:space="preserve">  "</w:t>
+      </w:r>
+      <w:proofErr w:type="spellStart"/>
+      <w:r>
+        <w:t>typ</w:t>
+      </w:r>
+      <w:proofErr w:type="spellEnd"/>
+      <w:r>
+        <w:t>": "JWT"</w:t>
       </w:r>
     </w:p>
     <w:p>
@@ -2428,7 +2611,23 @@
         <w:t>Registered Claims:</w:t>
       </w:r>
       <w:r>
-        <w:t xml:space="preserve"> Standardized claims like iss (issuer), exp (expiration time), sub (subject/user ID), and iat (issued at).</w:t>
+        <w:t xml:space="preserve"> Standardized claims like </w:t>
+      </w:r>
+      <w:proofErr w:type="spellStart"/>
+      <w:r>
+        <w:t>iss</w:t>
+      </w:r>
+      <w:proofErr w:type="spellEnd"/>
+      <w:r>
+        <w:t xml:space="preserve"> (issuer), exp (expiration time), sub (subject/user ID), and </w:t>
+      </w:r>
+      <w:proofErr w:type="spellStart"/>
+      <w:r>
+        <w:t>iat</w:t>
+      </w:r>
+      <w:proofErr w:type="spellEnd"/>
+      <w:r>
+        <w:t xml:space="preserve"> (issued at).</w:t>
       </w:r>
     </w:p>
     <w:p>
@@ -2717,7 +2916,15 @@
         <w:t>Token Storage:</w:t>
       </w:r>
       <w:r>
-        <w:t xml:space="preserve"> The client receives the JWT and stores it securely (e.g., HttpOnly cookies or secure memory).</w:t>
+        <w:t xml:space="preserve"> The client receives the JWT and stores it securely (e.g., </w:t>
+      </w:r>
+      <w:proofErr w:type="spellStart"/>
+      <w:r>
+        <w:t>HttpOnly</w:t>
+      </w:r>
+      <w:proofErr w:type="spellEnd"/>
+      <w:r>
+        <w:t xml:space="preserve"> cookies or secure memory).</w:t>
       </w:r>
     </w:p>
     <w:p>
@@ -2745,7 +2952,15 @@
     </w:p>
     <w:p>
       <w:r>
-        <w:t>Authorization: Bearer &lt;your_jwt_token_here&gt;</w:t>
+        <w:t>Authorization: Bearer &lt;</w:t>
+      </w:r>
+      <w:proofErr w:type="spellStart"/>
+      <w:r>
+        <w:t>your_jwt_token_here</w:t>
+      </w:r>
+      <w:proofErr w:type="spellEnd"/>
+      <w:r>
+        <w:t>&gt;</w:t>
       </w:r>
     </w:p>
     <w:p>
@@ -3144,12 +3359,37 @@
             <w:r>
               <w:t xml:space="preserve">Stored in a secure </w:t>
             </w:r>
+            <w:proofErr w:type="spellStart"/>
             <w:r>
               <w:rPr>
                 <w:b/>
                 <w:bCs/>
               </w:rPr>
-              <w:t>HttpOnly, SameSite, Secure Cookie</w:t>
+              <w:t>HttpOnly</w:t>
+            </w:r>
+            <w:proofErr w:type="spellEnd"/>
+            <w:r>
+              <w:rPr>
+                <w:b/>
+                <w:bCs/>
+              </w:rPr>
+              <w:t xml:space="preserve">, </w:t>
+            </w:r>
+            <w:proofErr w:type="spellStart"/>
+            <w:r>
+              <w:rPr>
+                <w:b/>
+                <w:bCs/>
+              </w:rPr>
+              <w:t>SameSite</w:t>
+            </w:r>
+            <w:proofErr w:type="spellEnd"/>
+            <w:r>
+              <w:rPr>
+                <w:b/>
+                <w:bCs/>
+              </w:rPr>
+              <w:t>, Secure Cookie</w:t>
             </w:r>
             <w:r>
               <w:t>.</w:t>
@@ -3358,36 +3598,621 @@
       </w:r>
     </w:p>
     <w:p>
-      <w:r>
-        <w:t xml:space="preserve">Whenever you want a field to </w:t>
-      </w:r>
-      <w:r>
-        <w:t>return to</w:t>
-      </w:r>
-      <w:r>
-        <w:t xml:space="preserve"> a field which is not present in database and you will calculate the data for that field </w:t>
-      </w:r>
-      <w:r>
-        <w:t>custom</w:t>
-      </w:r>
-      <w:r>
-        <w:t xml:space="preserve"> you can use serializer method in Django which is the most popular way for doing such type of tasks.</w:t>
-      </w:r>
-    </w:p>
-    <w:p>
-      <w:r>
-        <w:t>In source agreement we tell the DRF where to get the data in simple words we can say that take the value or attribute from another field</w:t>
+      <w:pPr>
+        <w:rPr>
+          <w:b/>
+          <w:bCs/>
+          <w:sz w:val="28"/>
+          <w:szCs w:val="28"/>
+          <w:u w:val="single"/>
+        </w:rPr>
+      </w:pPr>
+      <w:r>
+        <w:rPr>
+          <w:b/>
+          <w:bCs/>
+          <w:sz w:val="28"/>
+          <w:szCs w:val="28"/>
+          <w:u w:val="single"/>
+        </w:rPr>
+        <w:t>Day 9:</w:t>
+      </w:r>
+    </w:p>
+    <w:p/>
+    <w:p>
+      <w:pPr>
+        <w:rPr>
+          <w:b/>
+          <w:bCs/>
+        </w:rPr>
+      </w:pPr>
+      <w:r>
+        <w:rPr>
+          <w:b/>
+          <w:bCs/>
+        </w:rPr>
+        <w:t>1. What is a Nested Serializer?</w:t>
+      </w:r>
+    </w:p>
+    <w:p>
+      <w:r>
+        <w:t>A Nested Serializer is used when two or more database tables have a relationship (such as One-to-Many or Many-to-One), and you want to return the related data in a single API response.</w:t>
+      </w:r>
+    </w:p>
+    <w:p>
+      <w:pPr>
+        <w:rPr>
+          <w:b/>
+          <w:bCs/>
+        </w:rPr>
+      </w:pPr>
+      <w:r>
+        <w:rPr>
+          <w:b/>
+          <w:bCs/>
+        </w:rPr>
+        <w:t>Main Purpose</w:t>
+      </w:r>
+    </w:p>
+    <w:p>
+      <w:r>
+        <w:t>The main purpose of a Nested Serializer is to reduce extra API calls from the frontend. Instead of calling one API to get the main object and another API to get its related objects, the frontend receives everything in one response.</w:t>
+      </w:r>
+    </w:p>
+    <w:p>
+      <w:pPr>
+        <w:rPr>
+          <w:b/>
+          <w:bCs/>
+        </w:rPr>
+      </w:pPr>
+      <w:r>
+        <w:rPr>
+          <w:b/>
+          <w:bCs/>
+        </w:rPr>
+        <w:t>When to Use It</w:t>
+      </w:r>
+    </w:p>
+    <w:p>
+      <w:r>
+        <w:t>Use a Nested Serializer when:</w:t>
+      </w:r>
+    </w:p>
+    <w:p>
+      <w:pPr>
+        <w:numPr>
+          <w:ilvl w:val="0"/>
+          <w:numId w:val="23"/>
+        </w:numPr>
+      </w:pPr>
+      <w:r>
+        <w:t xml:space="preserve">Two models have a relationship. </w:t>
+      </w:r>
+    </w:p>
+    <w:p>
+      <w:pPr>
+        <w:numPr>
+          <w:ilvl w:val="0"/>
+          <w:numId w:val="23"/>
+        </w:numPr>
+      </w:pPr>
+      <w:r>
+        <w:t xml:space="preserve">The frontend needs related data together. </w:t>
+      </w:r>
+    </w:p>
+    <w:p>
+      <w:pPr>
+        <w:numPr>
+          <w:ilvl w:val="0"/>
+          <w:numId w:val="23"/>
+        </w:numPr>
+      </w:pPr>
+      <w:r>
+        <w:t xml:space="preserve">You want to make the API more convenient and reduce the number of requests. </w:t>
+      </w:r>
+    </w:p>
+    <w:p>
+      <w:pPr>
+        <w:rPr>
+          <w:b/>
+          <w:bCs/>
+        </w:rPr>
+      </w:pPr>
+      <w:r>
+        <w:rPr>
+          <w:b/>
+          <w:bCs/>
+        </w:rPr>
+        <w:t>Example Scenario</w:t>
+      </w:r>
+    </w:p>
+    <w:p>
+      <w:r>
+        <w:lastRenderedPageBreak/>
+        <w:t>Suppose you have:</w:t>
+      </w:r>
+    </w:p>
+    <w:p>
+      <w:pPr>
+        <w:numPr>
+          <w:ilvl w:val="0"/>
+          <w:numId w:val="24"/>
+        </w:numPr>
+      </w:pPr>
+      <w:r>
+        <w:t xml:space="preserve">A Course model </w:t>
+      </w:r>
+    </w:p>
+    <w:p>
+      <w:pPr>
+        <w:numPr>
+          <w:ilvl w:val="0"/>
+          <w:numId w:val="24"/>
+        </w:numPr>
+      </w:pPr>
+      <w:r>
+        <w:t xml:space="preserve">A Resource model </w:t>
+      </w:r>
+    </w:p>
+    <w:p>
+      <w:r>
+        <w:t>Each course has multiple resources.</w:t>
+      </w:r>
+    </w:p>
+    <w:p>
+      <w:r>
+        <w:t>Without a Nested Serializer:</w:t>
+      </w:r>
+    </w:p>
+    <w:p>
+      <w:pPr>
+        <w:numPr>
+          <w:ilvl w:val="0"/>
+          <w:numId w:val="25"/>
+        </w:numPr>
+      </w:pPr>
+      <w:r>
+        <w:t xml:space="preserve">API 1 returns course details. </w:t>
+      </w:r>
+    </w:p>
+    <w:p>
+      <w:pPr>
+        <w:numPr>
+          <w:ilvl w:val="0"/>
+          <w:numId w:val="25"/>
+        </w:numPr>
+      </w:pPr>
+      <w:r>
+        <w:t xml:space="preserve">API 2 returns the resources of that course. </w:t>
+      </w:r>
+    </w:p>
+    <w:p>
+      <w:r>
+        <w:t>With a Nested Serializer:</w:t>
+      </w:r>
+    </w:p>
+    <w:p>
+      <w:pPr>
+        <w:numPr>
+          <w:ilvl w:val="0"/>
+          <w:numId w:val="26"/>
+        </w:numPr>
+      </w:pPr>
+      <w:r>
+        <w:t xml:space="preserve">One API returns both the course details and all its resources together. </w:t>
+      </w:r>
+    </w:p>
+    <w:p>
+      <w:pPr>
+        <w:rPr>
+          <w:b/>
+          <w:bCs/>
+        </w:rPr>
+      </w:pPr>
+      <w:r>
+        <w:rPr>
+          <w:b/>
+          <w:bCs/>
+        </w:rPr>
+        <w:t>Key Point</w:t>
+      </w:r>
+    </w:p>
+    <w:p>
+      <w:r>
+        <w:t>A Nested Serializer improves API usability by including related objects in a single response.</w:t>
+      </w:r>
+    </w:p>
+    <w:p>
+      <w:r>
+        <w:pict w14:anchorId="699D711E">
+          <v:rect id="_x0000_i1046" style="width:0;height:1.5pt" o:hralign="center" o:hrstd="t" o:hr="t" fillcolor="#a0a0a0" stroked="f"/>
+        </w:pict>
+      </w:r>
+    </w:p>
+    <w:p>
+      <w:pPr>
+        <w:rPr>
+          <w:b/>
+          <w:bCs/>
+        </w:rPr>
+      </w:pPr>
+      <w:r>
+        <w:rPr>
+          <w:b/>
+          <w:bCs/>
+        </w:rPr>
+        <w:t>2. What is SerializerMethodField?</w:t>
+      </w:r>
+    </w:p>
+    <w:p>
+      <w:r>
+        <w:t>SerializerMethodField is a special serializer field that allows you to create a field that does not exist in the database.</w:t>
+      </w:r>
+    </w:p>
+    <w:p>
+      <w:r>
+        <w:t>Instead of reading its value from the database, Django REST Framework calls a custom method written by you, and that method returns the value.</w:t>
+      </w:r>
+    </w:p>
+    <w:p>
+      <w:pPr>
+        <w:rPr>
+          <w:b/>
+          <w:bCs/>
+        </w:rPr>
+      </w:pPr>
+      <w:r>
+        <w:rPr>
+          <w:b/>
+          <w:bCs/>
+        </w:rPr>
+        <w:t>Main Purpose</w:t>
+      </w:r>
+    </w:p>
+    <w:p>
+      <w:r>
+        <w:t>The main purpose of SerializerMethodField is to return computed or custom data in the API response.</w:t>
+      </w:r>
+    </w:p>
+    <w:p>
+      <w:pPr>
+        <w:rPr>
+          <w:b/>
+          <w:bCs/>
+        </w:rPr>
+      </w:pPr>
+      <w:r>
+        <w:rPr>
+          <w:b/>
+          <w:bCs/>
+        </w:rPr>
+        <w:t>When to Use It</w:t>
+      </w:r>
+    </w:p>
+    <w:p>
+      <w:r>
+        <w:t>Use SerializerMethodField when:</w:t>
+      </w:r>
+    </w:p>
+    <w:p>
+      <w:pPr>
+        <w:numPr>
+          <w:ilvl w:val="0"/>
+          <w:numId w:val="27"/>
+        </w:numPr>
+      </w:pPr>
+      <w:r>
+        <w:t xml:space="preserve">The field is not stored in the database. </w:t>
+      </w:r>
+    </w:p>
+    <w:p>
+      <w:pPr>
+        <w:numPr>
+          <w:ilvl w:val="0"/>
+          <w:numId w:val="27"/>
+        </w:numPr>
+      </w:pPr>
+      <w:r>
+        <w:t xml:space="preserve">The value needs to be calculated. </w:t>
+      </w:r>
+    </w:p>
+    <w:p>
+      <w:pPr>
+        <w:numPr>
+          <w:ilvl w:val="0"/>
+          <w:numId w:val="27"/>
+        </w:numPr>
+      </w:pPr>
+      <w:r>
+        <w:t xml:space="preserve">The value depends on custom business logic. </w:t>
+      </w:r>
+    </w:p>
+    <w:p>
+      <w:pPr>
+        <w:numPr>
+          <w:ilvl w:val="0"/>
+          <w:numId w:val="27"/>
+        </w:numPr>
+      </w:pPr>
+      <w:r>
+        <w:t xml:space="preserve">You want to show additional information to the user. </w:t>
+      </w:r>
+    </w:p>
+    <w:p>
+      <w:pPr>
+        <w:rPr>
+          <w:b/>
+          <w:bCs/>
+        </w:rPr>
+      </w:pPr>
+      <w:r>
+        <w:rPr>
+          <w:b/>
+          <w:bCs/>
+        </w:rPr>
+        <w:t>Examples</w:t>
+      </w:r>
+    </w:p>
+    <w:p>
+      <w:r>
+        <w:t>Some common examples include:</w:t>
+      </w:r>
+    </w:p>
+    <w:p>
+      <w:pPr>
+        <w:numPr>
+          <w:ilvl w:val="0"/>
+          <w:numId w:val="28"/>
+        </w:numPr>
+      </w:pPr>
+      <w:r>
+        <w:t xml:space="preserve">Full name (first name + last name) </w:t>
+      </w:r>
+    </w:p>
+    <w:p>
+      <w:pPr>
+        <w:numPr>
+          <w:ilvl w:val="0"/>
+          <w:numId w:val="28"/>
+        </w:numPr>
+      </w:pPr>
+      <w:r>
+        <w:t xml:space="preserve">Final price after discount </w:t>
+      </w:r>
+    </w:p>
+    <w:p>
+      <w:pPr>
+        <w:numPr>
+          <w:ilvl w:val="0"/>
+          <w:numId w:val="28"/>
+        </w:numPr>
+      </w:pPr>
+      <w:r>
+        <w:t xml:space="preserve">Total number of resources </w:t>
+      </w:r>
+    </w:p>
+    <w:p>
+      <w:pPr>
+        <w:numPr>
+          <w:ilvl w:val="0"/>
+          <w:numId w:val="28"/>
+        </w:numPr>
+      </w:pPr>
+      <w:r>
+        <w:t xml:space="preserve">Average rating </w:t>
+      </w:r>
+    </w:p>
+    <w:p>
+      <w:pPr>
+        <w:numPr>
+          <w:ilvl w:val="0"/>
+          <w:numId w:val="28"/>
+        </w:numPr>
+      </w:pPr>
+      <w:r>
+        <w:lastRenderedPageBreak/>
+        <w:t xml:space="preserve">Whether a user is an adult </w:t>
+      </w:r>
+    </w:p>
+    <w:p>
+      <w:pPr>
+        <w:numPr>
+          <w:ilvl w:val="0"/>
+          <w:numId w:val="28"/>
+        </w:numPr>
+      </w:pPr>
+      <w:r>
+        <w:t xml:space="preserve">A custom greeting message </w:t>
+      </w:r>
+    </w:p>
+    <w:p>
+      <w:pPr>
+        <w:rPr>
+          <w:b/>
+          <w:bCs/>
+        </w:rPr>
+      </w:pPr>
+      <w:r>
+        <w:rPr>
+          <w:b/>
+          <w:bCs/>
+        </w:rPr>
+        <w:t>Important Point</w:t>
+      </w:r>
+    </w:p>
+    <w:p>
+      <w:r>
+        <w:t xml:space="preserve">SerializerMethodField is </w:t>
+      </w:r>
+      <w:r>
+        <w:rPr>
+          <w:b/>
+          <w:bCs/>
+        </w:rPr>
+        <w:t>read-only</w:t>
       </w:r>
       <w:r>
         <w:t>.</w:t>
       </w:r>
-    </w:p>
-    <w:p>
-      <w:r>
-        <w:t>Serializer Method is a field which is not present in database but we create it manually using our custom logic written in serializer method.</w:t>
-      </w:r>
-    </w:p>
-    <w:p/>
+      <w:r>
+        <w:br/>
+        <w:t>It only sends data in the API response. It does not accept data from the client and cannot be used to save information in the database.</w:t>
+      </w:r>
+    </w:p>
+    <w:p>
+      <w:pPr>
+        <w:rPr>
+          <w:b/>
+          <w:bCs/>
+        </w:rPr>
+      </w:pPr>
+      <w:r>
+        <w:rPr>
+          <w:b/>
+          <w:bCs/>
+        </w:rPr>
+        <w:t>Key Point</w:t>
+      </w:r>
+    </w:p>
+    <w:p>
+      <w:r>
+        <w:t>SerializerMethodField is used whenever you want to return a custom or computed field that is not stored in the database.</w:t>
+      </w:r>
+    </w:p>
+    <w:p>
+      <w:r>
+        <w:pict w14:anchorId="58097EEA">
+          <v:rect id="_x0000_i1047" style="width:0;height:1.5pt" o:hralign="center" o:hrstd="t" o:hr="t" fillcolor="#a0a0a0" stroked="f"/>
+        </w:pict>
+      </w:r>
+    </w:p>
+    <w:p>
+      <w:pPr>
+        <w:rPr>
+          <w:b/>
+          <w:bCs/>
+        </w:rPr>
+      </w:pPr>
+      <w:r>
+        <w:rPr>
+          <w:b/>
+          <w:bCs/>
+        </w:rPr>
+        <w:t>3. What is the source Argument?</w:t>
+      </w:r>
+    </w:p>
+    <w:p>
+      <w:r>
+        <w:t>The source argument tells Django REST Framework where to get the value for a serializer field.</w:t>
+      </w:r>
+    </w:p>
+    <w:p>
+      <w:r>
+        <w:t>In simple words, it tells DRF:</w:t>
+      </w:r>
+    </w:p>
+    <w:p>
+      <w:r>
+        <w:t>"Take the value from another field, attribute, property, or method instead of looking for a field with this serializer field's name."</w:t>
+      </w:r>
+    </w:p>
+    <w:p>
+      <w:pPr>
+        <w:rPr>
+          <w:b/>
+          <w:bCs/>
+        </w:rPr>
+      </w:pPr>
+      <w:r>
+        <w:rPr>
+          <w:b/>
+          <w:bCs/>
+        </w:rPr>
+        <w:t>Main Purpose</w:t>
+      </w:r>
+    </w:p>
+    <w:p>
+      <w:r>
+        <w:t>The main purpose of source is to map one serializer field to another attribute or method.</w:t>
+      </w:r>
+    </w:p>
+    <w:p>
+      <w:pPr>
+        <w:rPr>
+          <w:b/>
+          <w:bCs/>
+          <w:sz w:val="28"/>
+          <w:szCs w:val="28"/>
+          <w:u w:val="single"/>
+        </w:rPr>
+      </w:pPr>
+      <w:r>
+        <w:rPr>
+          <w:b/>
+          <w:bCs/>
+          <w:sz w:val="28"/>
+          <w:szCs w:val="28"/>
+          <w:u w:val="single"/>
+        </w:rPr>
+        <w:t>Day 10:</w:t>
+      </w:r>
+    </w:p>
+    <w:p>
+      <w:r>
+        <w:t>When we are using API View method in Django for our rest api then we have to write every single api endpoint code manually for crud operations such as code for get post put delete request this is good when you are developing complex api endpoint because this is customizeable and full control is in your hand on the other hand when we are using modelviewset then Django rest framework handle all the crud api operations you don’t need to write messy code this is the actual advantage.</w:t>
+      </w:r>
+    </w:p>
+    <w:p>
+      <w:r>
+        <w:rPr>
+          <w:b/>
+          <w:bCs/>
+        </w:rPr>
+        <w:t>Default Router</w:t>
+      </w:r>
+      <w:r>
+        <w:t xml:space="preserve"> Normally, every URL needs to be defined manually (e.g., path('resources/', ...), path('resources/&lt;id&gt;/', ...), for handling different HTTP methods like GET, POST, PUT, and DELETE).</w:t>
+      </w:r>
+    </w:p>
+    <w:p>
+      <w:r>
+        <w:t xml:space="preserve">A </w:t>
+      </w:r>
+      <w:r>
+        <w:rPr>
+          <w:b/>
+          <w:bCs/>
+        </w:rPr>
+        <w:t>Router</w:t>
+      </w:r>
+      <w:r>
+        <w:t xml:space="preserve"> automates this entire process. By simply registering a </w:t>
+      </w:r>
+      <w:proofErr w:type="spellStart"/>
+      <w:r>
+        <w:t>ViewSet</w:t>
+      </w:r>
+      <w:proofErr w:type="spellEnd"/>
+      <w:r>
+        <w:t xml:space="preserve">, the router automatically generates all necessary URL patterns for standard operations such as </w:t>
+      </w:r>
+      <w:r>
+        <w:rPr>
+          <w:b/>
+          <w:bCs/>
+        </w:rPr>
+        <w:t>list, detail, create, update, and delete</w:t>
+      </w:r>
+      <w:r>
+        <w:t>.</w:t>
+      </w:r>
+    </w:p>
+    <w:p>
+      <w:r>
+        <w:t xml:space="preserve"> </w:t>
+      </w:r>
+    </w:p>
     <w:sectPr>
       <w:pgSz w:w="11907" w:h="16839" w:code="9"/>
       <w:pgMar w:top="720" w:right="720" w:bottom="720" w:left="720" w:header="0" w:footer="720" w:gutter="0"/>
@@ -3997,6 +4822,155 @@
     </w:lvl>
   </w:abstractNum>
   <w:abstractNum w:abstractNumId="4" w15:restartNumberingAfterBreak="0">
+    <w:nsid w:val="0FC70B28"/>
+    <w:multiLevelType w:val="multilevel"/>
+    <w:tmpl w:val="80908740"/>
+    <w:lvl w:ilvl="0">
+      <w:start w:val="1"/>
+      <w:numFmt w:val="bullet"/>
+      <w:lvlText w:val=""/>
+      <w:lvlJc w:val="left"/>
+      <w:pPr>
+        <w:tabs>
+          <w:tab w:val="num" w:pos="720"/>
+        </w:tabs>
+        <w:ind w:left="720" w:hanging="360"/>
+      </w:pPr>
+      <w:rPr>
+        <w:rFonts w:ascii="Symbol" w:hAnsi="Symbol" w:hint="default"/>
+        <w:sz w:val="20"/>
+      </w:rPr>
+    </w:lvl>
+    <w:lvl w:ilvl="1" w:tentative="1">
+      <w:start w:val="1"/>
+      <w:numFmt w:val="bullet"/>
+      <w:lvlText w:val="o"/>
+      <w:lvlJc w:val="left"/>
+      <w:pPr>
+        <w:tabs>
+          <w:tab w:val="num" w:pos="1440"/>
+        </w:tabs>
+        <w:ind w:left="1440" w:hanging="360"/>
+      </w:pPr>
+      <w:rPr>
+        <w:rFonts w:ascii="Courier New" w:hAnsi="Courier New" w:hint="default"/>
+        <w:sz w:val="20"/>
+      </w:rPr>
+    </w:lvl>
+    <w:lvl w:ilvl="2" w:tentative="1">
+      <w:start w:val="1"/>
+      <w:numFmt w:val="bullet"/>
+      <w:lvlText w:val=""/>
+      <w:lvlJc w:val="left"/>
+      <w:pPr>
+        <w:tabs>
+          <w:tab w:val="num" w:pos="2160"/>
+        </w:tabs>
+        <w:ind w:left="2160" w:hanging="360"/>
+      </w:pPr>
+      <w:rPr>
+        <w:rFonts w:ascii="Wingdings" w:hAnsi="Wingdings" w:hint="default"/>
+        <w:sz w:val="20"/>
+      </w:rPr>
+    </w:lvl>
+    <w:lvl w:ilvl="3" w:tentative="1">
+      <w:start w:val="1"/>
+      <w:numFmt w:val="bullet"/>
+      <w:lvlText w:val=""/>
+      <w:lvlJc w:val="left"/>
+      <w:pPr>
+        <w:tabs>
+          <w:tab w:val="num" w:pos="2880"/>
+        </w:tabs>
+        <w:ind w:left="2880" w:hanging="360"/>
+      </w:pPr>
+      <w:rPr>
+        <w:rFonts w:ascii="Wingdings" w:hAnsi="Wingdings" w:hint="default"/>
+        <w:sz w:val="20"/>
+      </w:rPr>
+    </w:lvl>
+    <w:lvl w:ilvl="4" w:tentative="1">
+      <w:start w:val="1"/>
+      <w:numFmt w:val="bullet"/>
+      <w:lvlText w:val=""/>
+      <w:lvlJc w:val="left"/>
+      <w:pPr>
+        <w:tabs>
+          <w:tab w:val="num" w:pos="3600"/>
+        </w:tabs>
+        <w:ind w:left="3600" w:hanging="360"/>
+      </w:pPr>
+      <w:rPr>
+        <w:rFonts w:ascii="Wingdings" w:hAnsi="Wingdings" w:hint="default"/>
+        <w:sz w:val="20"/>
+      </w:rPr>
+    </w:lvl>
+    <w:lvl w:ilvl="5" w:tentative="1">
+      <w:start w:val="1"/>
+      <w:numFmt w:val="bullet"/>
+      <w:lvlText w:val=""/>
+      <w:lvlJc w:val="left"/>
+      <w:pPr>
+        <w:tabs>
+          <w:tab w:val="num" w:pos="4320"/>
+        </w:tabs>
+        <w:ind w:left="4320" w:hanging="360"/>
+      </w:pPr>
+      <w:rPr>
+        <w:rFonts w:ascii="Wingdings" w:hAnsi="Wingdings" w:hint="default"/>
+        <w:sz w:val="20"/>
+      </w:rPr>
+    </w:lvl>
+    <w:lvl w:ilvl="6" w:tentative="1">
+      <w:start w:val="1"/>
+      <w:numFmt w:val="bullet"/>
+      <w:lvlText w:val=""/>
+      <w:lvlJc w:val="left"/>
+      <w:pPr>
+        <w:tabs>
+          <w:tab w:val="num" w:pos="5040"/>
+        </w:tabs>
+        <w:ind w:left="5040" w:hanging="360"/>
+      </w:pPr>
+      <w:rPr>
+        <w:rFonts w:ascii="Wingdings" w:hAnsi="Wingdings" w:hint="default"/>
+        <w:sz w:val="20"/>
+      </w:rPr>
+    </w:lvl>
+    <w:lvl w:ilvl="7" w:tentative="1">
+      <w:start w:val="1"/>
+      <w:numFmt w:val="bullet"/>
+      <w:lvlText w:val=""/>
+      <w:lvlJc w:val="left"/>
+      <w:pPr>
+        <w:tabs>
+          <w:tab w:val="num" w:pos="5760"/>
+        </w:tabs>
+        <w:ind w:left="5760" w:hanging="360"/>
+      </w:pPr>
+      <w:rPr>
+        <w:rFonts w:ascii="Wingdings" w:hAnsi="Wingdings" w:hint="default"/>
+        <w:sz w:val="20"/>
+      </w:rPr>
+    </w:lvl>
+    <w:lvl w:ilvl="8" w:tentative="1">
+      <w:start w:val="1"/>
+      <w:numFmt w:val="bullet"/>
+      <w:lvlText w:val=""/>
+      <w:lvlJc w:val="left"/>
+      <w:pPr>
+        <w:tabs>
+          <w:tab w:val="num" w:pos="6480"/>
+        </w:tabs>
+        <w:ind w:left="6480" w:hanging="360"/>
+      </w:pPr>
+      <w:rPr>
+        <w:rFonts w:ascii="Wingdings" w:hAnsi="Wingdings" w:hint="default"/>
+        <w:sz w:val="20"/>
+      </w:rPr>
+    </w:lvl>
+  </w:abstractNum>
+  <w:abstractNum w:abstractNumId="5" w15:restartNumberingAfterBreak="0">
     <w:nsid w:val="13D17F08"/>
     <w:multiLevelType w:val="multilevel"/>
     <w:tmpl w:val="63180BBE"/>
@@ -4145,7 +5119,454 @@
       </w:rPr>
     </w:lvl>
   </w:abstractNum>
-  <w:abstractNum w:abstractNumId="5" w15:restartNumberingAfterBreak="0">
+  <w:abstractNum w:abstractNumId="6" w15:restartNumberingAfterBreak="0">
+    <w:nsid w:val="1758327F"/>
+    <w:multiLevelType w:val="multilevel"/>
+    <w:tmpl w:val="D3026DB4"/>
+    <w:lvl w:ilvl="0">
+      <w:start w:val="1"/>
+      <w:numFmt w:val="bullet"/>
+      <w:lvlText w:val=""/>
+      <w:lvlJc w:val="left"/>
+      <w:pPr>
+        <w:tabs>
+          <w:tab w:val="num" w:pos="720"/>
+        </w:tabs>
+        <w:ind w:left="720" w:hanging="360"/>
+      </w:pPr>
+      <w:rPr>
+        <w:rFonts w:ascii="Symbol" w:hAnsi="Symbol" w:hint="default"/>
+        <w:sz w:val="20"/>
+      </w:rPr>
+    </w:lvl>
+    <w:lvl w:ilvl="1" w:tentative="1">
+      <w:start w:val="1"/>
+      <w:numFmt w:val="bullet"/>
+      <w:lvlText w:val="o"/>
+      <w:lvlJc w:val="left"/>
+      <w:pPr>
+        <w:tabs>
+          <w:tab w:val="num" w:pos="1440"/>
+        </w:tabs>
+        <w:ind w:left="1440" w:hanging="360"/>
+      </w:pPr>
+      <w:rPr>
+        <w:rFonts w:ascii="Courier New" w:hAnsi="Courier New" w:hint="default"/>
+        <w:sz w:val="20"/>
+      </w:rPr>
+    </w:lvl>
+    <w:lvl w:ilvl="2" w:tentative="1">
+      <w:start w:val="1"/>
+      <w:numFmt w:val="bullet"/>
+      <w:lvlText w:val=""/>
+      <w:lvlJc w:val="left"/>
+      <w:pPr>
+        <w:tabs>
+          <w:tab w:val="num" w:pos="2160"/>
+        </w:tabs>
+        <w:ind w:left="2160" w:hanging="360"/>
+      </w:pPr>
+      <w:rPr>
+        <w:rFonts w:ascii="Wingdings" w:hAnsi="Wingdings" w:hint="default"/>
+        <w:sz w:val="20"/>
+      </w:rPr>
+    </w:lvl>
+    <w:lvl w:ilvl="3" w:tentative="1">
+      <w:start w:val="1"/>
+      <w:numFmt w:val="bullet"/>
+      <w:lvlText w:val=""/>
+      <w:lvlJc w:val="left"/>
+      <w:pPr>
+        <w:tabs>
+          <w:tab w:val="num" w:pos="2880"/>
+        </w:tabs>
+        <w:ind w:left="2880" w:hanging="360"/>
+      </w:pPr>
+      <w:rPr>
+        <w:rFonts w:ascii="Wingdings" w:hAnsi="Wingdings" w:hint="default"/>
+        <w:sz w:val="20"/>
+      </w:rPr>
+    </w:lvl>
+    <w:lvl w:ilvl="4" w:tentative="1">
+      <w:start w:val="1"/>
+      <w:numFmt w:val="bullet"/>
+      <w:lvlText w:val=""/>
+      <w:lvlJc w:val="left"/>
+      <w:pPr>
+        <w:tabs>
+          <w:tab w:val="num" w:pos="3600"/>
+        </w:tabs>
+        <w:ind w:left="3600" w:hanging="360"/>
+      </w:pPr>
+      <w:rPr>
+        <w:rFonts w:ascii="Wingdings" w:hAnsi="Wingdings" w:hint="default"/>
+        <w:sz w:val="20"/>
+      </w:rPr>
+    </w:lvl>
+    <w:lvl w:ilvl="5" w:tentative="1">
+      <w:start w:val="1"/>
+      <w:numFmt w:val="bullet"/>
+      <w:lvlText w:val=""/>
+      <w:lvlJc w:val="left"/>
+      <w:pPr>
+        <w:tabs>
+          <w:tab w:val="num" w:pos="4320"/>
+        </w:tabs>
+        <w:ind w:left="4320" w:hanging="360"/>
+      </w:pPr>
+      <w:rPr>
+        <w:rFonts w:ascii="Wingdings" w:hAnsi="Wingdings" w:hint="default"/>
+        <w:sz w:val="20"/>
+      </w:rPr>
+    </w:lvl>
+    <w:lvl w:ilvl="6" w:tentative="1">
+      <w:start w:val="1"/>
+      <w:numFmt w:val="bullet"/>
+      <w:lvlText w:val=""/>
+      <w:lvlJc w:val="left"/>
+      <w:pPr>
+        <w:tabs>
+          <w:tab w:val="num" w:pos="5040"/>
+        </w:tabs>
+        <w:ind w:left="5040" w:hanging="360"/>
+      </w:pPr>
+      <w:rPr>
+        <w:rFonts w:ascii="Wingdings" w:hAnsi="Wingdings" w:hint="default"/>
+        <w:sz w:val="20"/>
+      </w:rPr>
+    </w:lvl>
+    <w:lvl w:ilvl="7" w:tentative="1">
+      <w:start w:val="1"/>
+      <w:numFmt w:val="bullet"/>
+      <w:lvlText w:val=""/>
+      <w:lvlJc w:val="left"/>
+      <w:pPr>
+        <w:tabs>
+          <w:tab w:val="num" w:pos="5760"/>
+        </w:tabs>
+        <w:ind w:left="5760" w:hanging="360"/>
+      </w:pPr>
+      <w:rPr>
+        <w:rFonts w:ascii="Wingdings" w:hAnsi="Wingdings" w:hint="default"/>
+        <w:sz w:val="20"/>
+      </w:rPr>
+    </w:lvl>
+    <w:lvl w:ilvl="8" w:tentative="1">
+      <w:start w:val="1"/>
+      <w:numFmt w:val="bullet"/>
+      <w:lvlText w:val=""/>
+      <w:lvlJc w:val="left"/>
+      <w:pPr>
+        <w:tabs>
+          <w:tab w:val="num" w:pos="6480"/>
+        </w:tabs>
+        <w:ind w:left="6480" w:hanging="360"/>
+      </w:pPr>
+      <w:rPr>
+        <w:rFonts w:ascii="Wingdings" w:hAnsi="Wingdings" w:hint="default"/>
+        <w:sz w:val="20"/>
+      </w:rPr>
+    </w:lvl>
+  </w:abstractNum>
+  <w:abstractNum w:abstractNumId="7" w15:restartNumberingAfterBreak="0">
+    <w:nsid w:val="196A28B9"/>
+    <w:multiLevelType w:val="multilevel"/>
+    <w:tmpl w:val="03C60C04"/>
+    <w:lvl w:ilvl="0">
+      <w:start w:val="1"/>
+      <w:numFmt w:val="bullet"/>
+      <w:lvlText w:val=""/>
+      <w:lvlJc w:val="left"/>
+      <w:pPr>
+        <w:tabs>
+          <w:tab w:val="num" w:pos="720"/>
+        </w:tabs>
+        <w:ind w:left="720" w:hanging="360"/>
+      </w:pPr>
+      <w:rPr>
+        <w:rFonts w:ascii="Symbol" w:hAnsi="Symbol" w:hint="default"/>
+        <w:sz w:val="20"/>
+      </w:rPr>
+    </w:lvl>
+    <w:lvl w:ilvl="1" w:tentative="1">
+      <w:start w:val="1"/>
+      <w:numFmt w:val="bullet"/>
+      <w:lvlText w:val="o"/>
+      <w:lvlJc w:val="left"/>
+      <w:pPr>
+        <w:tabs>
+          <w:tab w:val="num" w:pos="1440"/>
+        </w:tabs>
+        <w:ind w:left="1440" w:hanging="360"/>
+      </w:pPr>
+      <w:rPr>
+        <w:rFonts w:ascii="Courier New" w:hAnsi="Courier New" w:hint="default"/>
+        <w:sz w:val="20"/>
+      </w:rPr>
+    </w:lvl>
+    <w:lvl w:ilvl="2" w:tentative="1">
+      <w:start w:val="1"/>
+      <w:numFmt w:val="bullet"/>
+      <w:lvlText w:val=""/>
+      <w:lvlJc w:val="left"/>
+      <w:pPr>
+        <w:tabs>
+          <w:tab w:val="num" w:pos="2160"/>
+        </w:tabs>
+        <w:ind w:left="2160" w:hanging="360"/>
+      </w:pPr>
+      <w:rPr>
+        <w:rFonts w:ascii="Wingdings" w:hAnsi="Wingdings" w:hint="default"/>
+        <w:sz w:val="20"/>
+      </w:rPr>
+    </w:lvl>
+    <w:lvl w:ilvl="3" w:tentative="1">
+      <w:start w:val="1"/>
+      <w:numFmt w:val="bullet"/>
+      <w:lvlText w:val=""/>
+      <w:lvlJc w:val="left"/>
+      <w:pPr>
+        <w:tabs>
+          <w:tab w:val="num" w:pos="2880"/>
+        </w:tabs>
+        <w:ind w:left="2880" w:hanging="360"/>
+      </w:pPr>
+      <w:rPr>
+        <w:rFonts w:ascii="Wingdings" w:hAnsi="Wingdings" w:hint="default"/>
+        <w:sz w:val="20"/>
+      </w:rPr>
+    </w:lvl>
+    <w:lvl w:ilvl="4" w:tentative="1">
+      <w:start w:val="1"/>
+      <w:numFmt w:val="bullet"/>
+      <w:lvlText w:val=""/>
+      <w:lvlJc w:val="left"/>
+      <w:pPr>
+        <w:tabs>
+          <w:tab w:val="num" w:pos="3600"/>
+        </w:tabs>
+        <w:ind w:left="3600" w:hanging="360"/>
+      </w:pPr>
+      <w:rPr>
+        <w:rFonts w:ascii="Wingdings" w:hAnsi="Wingdings" w:hint="default"/>
+        <w:sz w:val="20"/>
+      </w:rPr>
+    </w:lvl>
+    <w:lvl w:ilvl="5" w:tentative="1">
+      <w:start w:val="1"/>
+      <w:numFmt w:val="bullet"/>
+      <w:lvlText w:val=""/>
+      <w:lvlJc w:val="left"/>
+      <w:pPr>
+        <w:tabs>
+          <w:tab w:val="num" w:pos="4320"/>
+        </w:tabs>
+        <w:ind w:left="4320" w:hanging="360"/>
+      </w:pPr>
+      <w:rPr>
+        <w:rFonts w:ascii="Wingdings" w:hAnsi="Wingdings" w:hint="default"/>
+        <w:sz w:val="20"/>
+      </w:rPr>
+    </w:lvl>
+    <w:lvl w:ilvl="6" w:tentative="1">
+      <w:start w:val="1"/>
+      <w:numFmt w:val="bullet"/>
+      <w:lvlText w:val=""/>
+      <w:lvlJc w:val="left"/>
+      <w:pPr>
+        <w:tabs>
+          <w:tab w:val="num" w:pos="5040"/>
+        </w:tabs>
+        <w:ind w:left="5040" w:hanging="360"/>
+      </w:pPr>
+      <w:rPr>
+        <w:rFonts w:ascii="Wingdings" w:hAnsi="Wingdings" w:hint="default"/>
+        <w:sz w:val="20"/>
+      </w:rPr>
+    </w:lvl>
+    <w:lvl w:ilvl="7" w:tentative="1">
+      <w:start w:val="1"/>
+      <w:numFmt w:val="bullet"/>
+      <w:lvlText w:val=""/>
+      <w:lvlJc w:val="left"/>
+      <w:pPr>
+        <w:tabs>
+          <w:tab w:val="num" w:pos="5760"/>
+        </w:tabs>
+        <w:ind w:left="5760" w:hanging="360"/>
+      </w:pPr>
+      <w:rPr>
+        <w:rFonts w:ascii="Wingdings" w:hAnsi="Wingdings" w:hint="default"/>
+        <w:sz w:val="20"/>
+      </w:rPr>
+    </w:lvl>
+    <w:lvl w:ilvl="8" w:tentative="1">
+      <w:start w:val="1"/>
+      <w:numFmt w:val="bullet"/>
+      <w:lvlText w:val=""/>
+      <w:lvlJc w:val="left"/>
+      <w:pPr>
+        <w:tabs>
+          <w:tab w:val="num" w:pos="6480"/>
+        </w:tabs>
+        <w:ind w:left="6480" w:hanging="360"/>
+      </w:pPr>
+      <w:rPr>
+        <w:rFonts w:ascii="Wingdings" w:hAnsi="Wingdings" w:hint="default"/>
+        <w:sz w:val="20"/>
+      </w:rPr>
+    </w:lvl>
+  </w:abstractNum>
+  <w:abstractNum w:abstractNumId="8" w15:restartNumberingAfterBreak="0">
+    <w:nsid w:val="1ABD7D5C"/>
+    <w:multiLevelType w:val="multilevel"/>
+    <w:tmpl w:val="EEF26670"/>
+    <w:lvl w:ilvl="0">
+      <w:start w:val="1"/>
+      <w:numFmt w:val="bullet"/>
+      <w:lvlText w:val=""/>
+      <w:lvlJc w:val="left"/>
+      <w:pPr>
+        <w:tabs>
+          <w:tab w:val="num" w:pos="720"/>
+        </w:tabs>
+        <w:ind w:left="720" w:hanging="360"/>
+      </w:pPr>
+      <w:rPr>
+        <w:rFonts w:ascii="Symbol" w:hAnsi="Symbol" w:hint="default"/>
+        <w:sz w:val="20"/>
+      </w:rPr>
+    </w:lvl>
+    <w:lvl w:ilvl="1" w:tentative="1">
+      <w:start w:val="1"/>
+      <w:numFmt w:val="bullet"/>
+      <w:lvlText w:val="o"/>
+      <w:lvlJc w:val="left"/>
+      <w:pPr>
+        <w:tabs>
+          <w:tab w:val="num" w:pos="1440"/>
+        </w:tabs>
+        <w:ind w:left="1440" w:hanging="360"/>
+      </w:pPr>
+      <w:rPr>
+        <w:rFonts w:ascii="Courier New" w:hAnsi="Courier New" w:hint="default"/>
+        <w:sz w:val="20"/>
+      </w:rPr>
+    </w:lvl>
+    <w:lvl w:ilvl="2" w:tentative="1">
+      <w:start w:val="1"/>
+      <w:numFmt w:val="bullet"/>
+      <w:lvlText w:val=""/>
+      <w:lvlJc w:val="left"/>
+      <w:pPr>
+        <w:tabs>
+          <w:tab w:val="num" w:pos="2160"/>
+        </w:tabs>
+        <w:ind w:left="2160" w:hanging="360"/>
+      </w:pPr>
+      <w:rPr>
+        <w:rFonts w:ascii="Wingdings" w:hAnsi="Wingdings" w:hint="default"/>
+        <w:sz w:val="20"/>
+      </w:rPr>
+    </w:lvl>
+    <w:lvl w:ilvl="3" w:tentative="1">
+      <w:start w:val="1"/>
+      <w:numFmt w:val="bullet"/>
+      <w:lvlText w:val=""/>
+      <w:lvlJc w:val="left"/>
+      <w:pPr>
+        <w:tabs>
+          <w:tab w:val="num" w:pos="2880"/>
+        </w:tabs>
+        <w:ind w:left="2880" w:hanging="360"/>
+      </w:pPr>
+      <w:rPr>
+        <w:rFonts w:ascii="Wingdings" w:hAnsi="Wingdings" w:hint="default"/>
+        <w:sz w:val="20"/>
+      </w:rPr>
+    </w:lvl>
+    <w:lvl w:ilvl="4" w:tentative="1">
+      <w:start w:val="1"/>
+      <w:numFmt w:val="bullet"/>
+      <w:lvlText w:val=""/>
+      <w:lvlJc w:val="left"/>
+      <w:pPr>
+        <w:tabs>
+          <w:tab w:val="num" w:pos="3600"/>
+        </w:tabs>
+        <w:ind w:left="3600" w:hanging="360"/>
+      </w:pPr>
+      <w:rPr>
+        <w:rFonts w:ascii="Wingdings" w:hAnsi="Wingdings" w:hint="default"/>
+        <w:sz w:val="20"/>
+      </w:rPr>
+    </w:lvl>
+    <w:lvl w:ilvl="5" w:tentative="1">
+      <w:start w:val="1"/>
+      <w:numFmt w:val="bullet"/>
+      <w:lvlText w:val=""/>
+      <w:lvlJc w:val="left"/>
+      <w:pPr>
+        <w:tabs>
+          <w:tab w:val="num" w:pos="4320"/>
+        </w:tabs>
+        <w:ind w:left="4320" w:hanging="360"/>
+      </w:pPr>
+      <w:rPr>
+        <w:rFonts w:ascii="Wingdings" w:hAnsi="Wingdings" w:hint="default"/>
+        <w:sz w:val="20"/>
+      </w:rPr>
+    </w:lvl>
+    <w:lvl w:ilvl="6" w:tentative="1">
+      <w:start w:val="1"/>
+      <w:numFmt w:val="bullet"/>
+      <w:lvlText w:val=""/>
+      <w:lvlJc w:val="left"/>
+      <w:pPr>
+        <w:tabs>
+          <w:tab w:val="num" w:pos="5040"/>
+        </w:tabs>
+        <w:ind w:left="5040" w:hanging="360"/>
+      </w:pPr>
+      <w:rPr>
+        <w:rFonts w:ascii="Wingdings" w:hAnsi="Wingdings" w:hint="default"/>
+        <w:sz w:val="20"/>
+      </w:rPr>
+    </w:lvl>
+    <w:lvl w:ilvl="7" w:tentative="1">
+      <w:start w:val="1"/>
+      <w:numFmt w:val="bullet"/>
+      <w:lvlText w:val=""/>
+      <w:lvlJc w:val="left"/>
+      <w:pPr>
+        <w:tabs>
+          <w:tab w:val="num" w:pos="5760"/>
+        </w:tabs>
+        <w:ind w:left="5760" w:hanging="360"/>
+      </w:pPr>
+      <w:rPr>
+        <w:rFonts w:ascii="Wingdings" w:hAnsi="Wingdings" w:hint="default"/>
+        <w:sz w:val="20"/>
+      </w:rPr>
+    </w:lvl>
+    <w:lvl w:ilvl="8" w:tentative="1">
+      <w:start w:val="1"/>
+      <w:numFmt w:val="bullet"/>
+      <w:lvlText w:val=""/>
+      <w:lvlJc w:val="left"/>
+      <w:pPr>
+        <w:tabs>
+          <w:tab w:val="num" w:pos="6480"/>
+        </w:tabs>
+        <w:ind w:left="6480" w:hanging="360"/>
+      </w:pPr>
+      <w:rPr>
+        <w:rFonts w:ascii="Wingdings" w:hAnsi="Wingdings" w:hint="default"/>
+        <w:sz w:val="20"/>
+      </w:rPr>
+    </w:lvl>
+  </w:abstractNum>
+  <w:abstractNum w:abstractNumId="9" w15:restartNumberingAfterBreak="0">
     <w:nsid w:val="20384D0B"/>
     <w:multiLevelType w:val="multilevel"/>
     <w:tmpl w:val="B3BA8252"/>
@@ -4294,7 +5715,7 @@
       </w:rPr>
     </w:lvl>
   </w:abstractNum>
-  <w:abstractNum w:abstractNumId="6" w15:restartNumberingAfterBreak="0">
+  <w:abstractNum w:abstractNumId="10" w15:restartNumberingAfterBreak="0">
     <w:nsid w:val="2806293B"/>
     <w:multiLevelType w:val="multilevel"/>
     <w:tmpl w:val="EEBAFAE6"/>
@@ -4443,7 +5864,7 @@
       </w:rPr>
     </w:lvl>
   </w:abstractNum>
-  <w:abstractNum w:abstractNumId="7" w15:restartNumberingAfterBreak="0">
+  <w:abstractNum w:abstractNumId="11" w15:restartNumberingAfterBreak="0">
     <w:nsid w:val="2EAD526D"/>
     <w:multiLevelType w:val="multilevel"/>
     <w:tmpl w:val="D5DE5EEE"/>
@@ -4592,7 +6013,7 @@
       </w:rPr>
     </w:lvl>
   </w:abstractNum>
-  <w:abstractNum w:abstractNumId="8" w15:restartNumberingAfterBreak="0">
+  <w:abstractNum w:abstractNumId="12" w15:restartNumberingAfterBreak="0">
     <w:nsid w:val="2FDB2C62"/>
     <w:multiLevelType w:val="multilevel"/>
     <w:tmpl w:val="B148B288"/>
@@ -4741,7 +6162,305 @@
       </w:rPr>
     </w:lvl>
   </w:abstractNum>
-  <w:abstractNum w:abstractNumId="9" w15:restartNumberingAfterBreak="0">
+  <w:abstractNum w:abstractNumId="13" w15:restartNumberingAfterBreak="0">
+    <w:nsid w:val="314306EA"/>
+    <w:multiLevelType w:val="multilevel"/>
+    <w:tmpl w:val="046E46CC"/>
+    <w:lvl w:ilvl="0">
+      <w:start w:val="1"/>
+      <w:numFmt w:val="bullet"/>
+      <w:lvlText w:val=""/>
+      <w:lvlJc w:val="left"/>
+      <w:pPr>
+        <w:tabs>
+          <w:tab w:val="num" w:pos="720"/>
+        </w:tabs>
+        <w:ind w:left="720" w:hanging="360"/>
+      </w:pPr>
+      <w:rPr>
+        <w:rFonts w:ascii="Symbol" w:hAnsi="Symbol" w:hint="default"/>
+        <w:sz w:val="20"/>
+      </w:rPr>
+    </w:lvl>
+    <w:lvl w:ilvl="1" w:tentative="1">
+      <w:start w:val="1"/>
+      <w:numFmt w:val="bullet"/>
+      <w:lvlText w:val="o"/>
+      <w:lvlJc w:val="left"/>
+      <w:pPr>
+        <w:tabs>
+          <w:tab w:val="num" w:pos="1440"/>
+        </w:tabs>
+        <w:ind w:left="1440" w:hanging="360"/>
+      </w:pPr>
+      <w:rPr>
+        <w:rFonts w:ascii="Courier New" w:hAnsi="Courier New" w:hint="default"/>
+        <w:sz w:val="20"/>
+      </w:rPr>
+    </w:lvl>
+    <w:lvl w:ilvl="2" w:tentative="1">
+      <w:start w:val="1"/>
+      <w:numFmt w:val="bullet"/>
+      <w:lvlText w:val=""/>
+      <w:lvlJc w:val="left"/>
+      <w:pPr>
+        <w:tabs>
+          <w:tab w:val="num" w:pos="2160"/>
+        </w:tabs>
+        <w:ind w:left="2160" w:hanging="360"/>
+      </w:pPr>
+      <w:rPr>
+        <w:rFonts w:ascii="Wingdings" w:hAnsi="Wingdings" w:hint="default"/>
+        <w:sz w:val="20"/>
+      </w:rPr>
+    </w:lvl>
+    <w:lvl w:ilvl="3" w:tentative="1">
+      <w:start w:val="1"/>
+      <w:numFmt w:val="bullet"/>
+      <w:lvlText w:val=""/>
+      <w:lvlJc w:val="left"/>
+      <w:pPr>
+        <w:tabs>
+          <w:tab w:val="num" w:pos="2880"/>
+        </w:tabs>
+        <w:ind w:left="2880" w:hanging="360"/>
+      </w:pPr>
+      <w:rPr>
+        <w:rFonts w:ascii="Wingdings" w:hAnsi="Wingdings" w:hint="default"/>
+        <w:sz w:val="20"/>
+      </w:rPr>
+    </w:lvl>
+    <w:lvl w:ilvl="4" w:tentative="1">
+      <w:start w:val="1"/>
+      <w:numFmt w:val="bullet"/>
+      <w:lvlText w:val=""/>
+      <w:lvlJc w:val="left"/>
+      <w:pPr>
+        <w:tabs>
+          <w:tab w:val="num" w:pos="3600"/>
+        </w:tabs>
+        <w:ind w:left="3600" w:hanging="360"/>
+      </w:pPr>
+      <w:rPr>
+        <w:rFonts w:ascii="Wingdings" w:hAnsi="Wingdings" w:hint="default"/>
+        <w:sz w:val="20"/>
+      </w:rPr>
+    </w:lvl>
+    <w:lvl w:ilvl="5" w:tentative="1">
+      <w:start w:val="1"/>
+      <w:numFmt w:val="bullet"/>
+      <w:lvlText w:val=""/>
+      <w:lvlJc w:val="left"/>
+      <w:pPr>
+        <w:tabs>
+          <w:tab w:val="num" w:pos="4320"/>
+        </w:tabs>
+        <w:ind w:left="4320" w:hanging="360"/>
+      </w:pPr>
+      <w:rPr>
+        <w:rFonts w:ascii="Wingdings" w:hAnsi="Wingdings" w:hint="default"/>
+        <w:sz w:val="20"/>
+      </w:rPr>
+    </w:lvl>
+    <w:lvl w:ilvl="6" w:tentative="1">
+      <w:start w:val="1"/>
+      <w:numFmt w:val="bullet"/>
+      <w:lvlText w:val=""/>
+      <w:lvlJc w:val="left"/>
+      <w:pPr>
+        <w:tabs>
+          <w:tab w:val="num" w:pos="5040"/>
+        </w:tabs>
+        <w:ind w:left="5040" w:hanging="360"/>
+      </w:pPr>
+      <w:rPr>
+        <w:rFonts w:ascii="Wingdings" w:hAnsi="Wingdings" w:hint="default"/>
+        <w:sz w:val="20"/>
+      </w:rPr>
+    </w:lvl>
+    <w:lvl w:ilvl="7" w:tentative="1">
+      <w:start w:val="1"/>
+      <w:numFmt w:val="bullet"/>
+      <w:lvlText w:val=""/>
+      <w:lvlJc w:val="left"/>
+      <w:pPr>
+        <w:tabs>
+          <w:tab w:val="num" w:pos="5760"/>
+        </w:tabs>
+        <w:ind w:left="5760" w:hanging="360"/>
+      </w:pPr>
+      <w:rPr>
+        <w:rFonts w:ascii="Wingdings" w:hAnsi="Wingdings" w:hint="default"/>
+        <w:sz w:val="20"/>
+      </w:rPr>
+    </w:lvl>
+    <w:lvl w:ilvl="8" w:tentative="1">
+      <w:start w:val="1"/>
+      <w:numFmt w:val="bullet"/>
+      <w:lvlText w:val=""/>
+      <w:lvlJc w:val="left"/>
+      <w:pPr>
+        <w:tabs>
+          <w:tab w:val="num" w:pos="6480"/>
+        </w:tabs>
+        <w:ind w:left="6480" w:hanging="360"/>
+      </w:pPr>
+      <w:rPr>
+        <w:rFonts w:ascii="Wingdings" w:hAnsi="Wingdings" w:hint="default"/>
+        <w:sz w:val="20"/>
+      </w:rPr>
+    </w:lvl>
+  </w:abstractNum>
+  <w:abstractNum w:abstractNumId="14" w15:restartNumberingAfterBreak="0">
+    <w:nsid w:val="34C81E33"/>
+    <w:multiLevelType w:val="multilevel"/>
+    <w:tmpl w:val="710E9028"/>
+    <w:lvl w:ilvl="0">
+      <w:start w:val="1"/>
+      <w:numFmt w:val="bullet"/>
+      <w:lvlText w:val=""/>
+      <w:lvlJc w:val="left"/>
+      <w:pPr>
+        <w:tabs>
+          <w:tab w:val="num" w:pos="720"/>
+        </w:tabs>
+        <w:ind w:left="720" w:hanging="360"/>
+      </w:pPr>
+      <w:rPr>
+        <w:rFonts w:ascii="Symbol" w:hAnsi="Symbol" w:hint="default"/>
+        <w:sz w:val="20"/>
+      </w:rPr>
+    </w:lvl>
+    <w:lvl w:ilvl="1" w:tentative="1">
+      <w:start w:val="1"/>
+      <w:numFmt w:val="bullet"/>
+      <w:lvlText w:val="o"/>
+      <w:lvlJc w:val="left"/>
+      <w:pPr>
+        <w:tabs>
+          <w:tab w:val="num" w:pos="1440"/>
+        </w:tabs>
+        <w:ind w:left="1440" w:hanging="360"/>
+      </w:pPr>
+      <w:rPr>
+        <w:rFonts w:ascii="Courier New" w:hAnsi="Courier New" w:hint="default"/>
+        <w:sz w:val="20"/>
+      </w:rPr>
+    </w:lvl>
+    <w:lvl w:ilvl="2" w:tentative="1">
+      <w:start w:val="1"/>
+      <w:numFmt w:val="bullet"/>
+      <w:lvlText w:val=""/>
+      <w:lvlJc w:val="left"/>
+      <w:pPr>
+        <w:tabs>
+          <w:tab w:val="num" w:pos="2160"/>
+        </w:tabs>
+        <w:ind w:left="2160" w:hanging="360"/>
+      </w:pPr>
+      <w:rPr>
+        <w:rFonts w:ascii="Wingdings" w:hAnsi="Wingdings" w:hint="default"/>
+        <w:sz w:val="20"/>
+      </w:rPr>
+    </w:lvl>
+    <w:lvl w:ilvl="3" w:tentative="1">
+      <w:start w:val="1"/>
+      <w:numFmt w:val="bullet"/>
+      <w:lvlText w:val=""/>
+      <w:lvlJc w:val="left"/>
+      <w:pPr>
+        <w:tabs>
+          <w:tab w:val="num" w:pos="2880"/>
+        </w:tabs>
+        <w:ind w:left="2880" w:hanging="360"/>
+      </w:pPr>
+      <w:rPr>
+        <w:rFonts w:ascii="Wingdings" w:hAnsi="Wingdings" w:hint="default"/>
+        <w:sz w:val="20"/>
+      </w:rPr>
+    </w:lvl>
+    <w:lvl w:ilvl="4" w:tentative="1">
+      <w:start w:val="1"/>
+      <w:numFmt w:val="bullet"/>
+      <w:lvlText w:val=""/>
+      <w:lvlJc w:val="left"/>
+      <w:pPr>
+        <w:tabs>
+          <w:tab w:val="num" w:pos="3600"/>
+        </w:tabs>
+        <w:ind w:left="3600" w:hanging="360"/>
+      </w:pPr>
+      <w:rPr>
+        <w:rFonts w:ascii="Wingdings" w:hAnsi="Wingdings" w:hint="default"/>
+        <w:sz w:val="20"/>
+      </w:rPr>
+    </w:lvl>
+    <w:lvl w:ilvl="5" w:tentative="1">
+      <w:start w:val="1"/>
+      <w:numFmt w:val="bullet"/>
+      <w:lvlText w:val=""/>
+      <w:lvlJc w:val="left"/>
+      <w:pPr>
+        <w:tabs>
+          <w:tab w:val="num" w:pos="4320"/>
+        </w:tabs>
+        <w:ind w:left="4320" w:hanging="360"/>
+      </w:pPr>
+      <w:rPr>
+        <w:rFonts w:ascii="Wingdings" w:hAnsi="Wingdings" w:hint="default"/>
+        <w:sz w:val="20"/>
+      </w:rPr>
+    </w:lvl>
+    <w:lvl w:ilvl="6" w:tentative="1">
+      <w:start w:val="1"/>
+      <w:numFmt w:val="bullet"/>
+      <w:lvlText w:val=""/>
+      <w:lvlJc w:val="left"/>
+      <w:pPr>
+        <w:tabs>
+          <w:tab w:val="num" w:pos="5040"/>
+        </w:tabs>
+        <w:ind w:left="5040" w:hanging="360"/>
+      </w:pPr>
+      <w:rPr>
+        <w:rFonts w:ascii="Wingdings" w:hAnsi="Wingdings" w:hint="default"/>
+        <w:sz w:val="20"/>
+      </w:rPr>
+    </w:lvl>
+    <w:lvl w:ilvl="7" w:tentative="1">
+      <w:start w:val="1"/>
+      <w:numFmt w:val="bullet"/>
+      <w:lvlText w:val=""/>
+      <w:lvlJc w:val="left"/>
+      <w:pPr>
+        <w:tabs>
+          <w:tab w:val="num" w:pos="5760"/>
+        </w:tabs>
+        <w:ind w:left="5760" w:hanging="360"/>
+      </w:pPr>
+      <w:rPr>
+        <w:rFonts w:ascii="Wingdings" w:hAnsi="Wingdings" w:hint="default"/>
+        <w:sz w:val="20"/>
+      </w:rPr>
+    </w:lvl>
+    <w:lvl w:ilvl="8" w:tentative="1">
+      <w:start w:val="1"/>
+      <w:numFmt w:val="bullet"/>
+      <w:lvlText w:val=""/>
+      <w:lvlJc w:val="left"/>
+      <w:pPr>
+        <w:tabs>
+          <w:tab w:val="num" w:pos="6480"/>
+        </w:tabs>
+        <w:ind w:left="6480" w:hanging="360"/>
+      </w:pPr>
+      <w:rPr>
+        <w:rFonts w:ascii="Wingdings" w:hAnsi="Wingdings" w:hint="default"/>
+        <w:sz w:val="20"/>
+      </w:rPr>
+    </w:lvl>
+  </w:abstractNum>
+  <w:abstractNum w:abstractNumId="15" w15:restartNumberingAfterBreak="0">
     <w:nsid w:val="3682520D"/>
     <w:multiLevelType w:val="multilevel"/>
     <w:tmpl w:val="0EB0E0AE"/>
@@ -4890,7 +6609,7 @@
       </w:rPr>
     </w:lvl>
   </w:abstractNum>
-  <w:abstractNum w:abstractNumId="10" w15:restartNumberingAfterBreak="0">
+  <w:abstractNum w:abstractNumId="16" w15:restartNumberingAfterBreak="0">
     <w:nsid w:val="37876CF5"/>
     <w:multiLevelType w:val="multilevel"/>
     <w:tmpl w:val="A44A2F9A"/>
@@ -5003,7 +6722,7 @@
       </w:pPr>
     </w:lvl>
   </w:abstractNum>
-  <w:abstractNum w:abstractNumId="11" w15:restartNumberingAfterBreak="0">
+  <w:abstractNum w:abstractNumId="17" w15:restartNumberingAfterBreak="0">
     <w:nsid w:val="37FD1BB0"/>
     <w:multiLevelType w:val="multilevel"/>
     <w:tmpl w:val="ED8E0874"/>
@@ -5120,7 +6839,7 @@
       </w:pPr>
     </w:lvl>
   </w:abstractNum>
-  <w:abstractNum w:abstractNumId="12" w15:restartNumberingAfterBreak="0">
+  <w:abstractNum w:abstractNumId="18" w15:restartNumberingAfterBreak="0">
     <w:nsid w:val="3D7579F9"/>
     <w:multiLevelType w:val="multilevel"/>
     <w:tmpl w:val="4E1E3E1A"/>
@@ -5269,7 +6988,305 @@
       </w:rPr>
     </w:lvl>
   </w:abstractNum>
-  <w:abstractNum w:abstractNumId="13" w15:restartNumberingAfterBreak="0">
+  <w:abstractNum w:abstractNumId="19" w15:restartNumberingAfterBreak="0">
+    <w:nsid w:val="455872EC"/>
+    <w:multiLevelType w:val="multilevel"/>
+    <w:tmpl w:val="38404D70"/>
+    <w:lvl w:ilvl="0">
+      <w:start w:val="1"/>
+      <w:numFmt w:val="bullet"/>
+      <w:lvlText w:val=""/>
+      <w:lvlJc w:val="left"/>
+      <w:pPr>
+        <w:tabs>
+          <w:tab w:val="num" w:pos="720"/>
+        </w:tabs>
+        <w:ind w:left="720" w:hanging="360"/>
+      </w:pPr>
+      <w:rPr>
+        <w:rFonts w:ascii="Symbol" w:hAnsi="Symbol" w:hint="default"/>
+        <w:sz w:val="20"/>
+      </w:rPr>
+    </w:lvl>
+    <w:lvl w:ilvl="1" w:tentative="1">
+      <w:start w:val="1"/>
+      <w:numFmt w:val="bullet"/>
+      <w:lvlText w:val="o"/>
+      <w:lvlJc w:val="left"/>
+      <w:pPr>
+        <w:tabs>
+          <w:tab w:val="num" w:pos="1440"/>
+        </w:tabs>
+        <w:ind w:left="1440" w:hanging="360"/>
+      </w:pPr>
+      <w:rPr>
+        <w:rFonts w:ascii="Courier New" w:hAnsi="Courier New" w:hint="default"/>
+        <w:sz w:val="20"/>
+      </w:rPr>
+    </w:lvl>
+    <w:lvl w:ilvl="2" w:tentative="1">
+      <w:start w:val="1"/>
+      <w:numFmt w:val="bullet"/>
+      <w:lvlText w:val=""/>
+      <w:lvlJc w:val="left"/>
+      <w:pPr>
+        <w:tabs>
+          <w:tab w:val="num" w:pos="2160"/>
+        </w:tabs>
+        <w:ind w:left="2160" w:hanging="360"/>
+      </w:pPr>
+      <w:rPr>
+        <w:rFonts w:ascii="Wingdings" w:hAnsi="Wingdings" w:hint="default"/>
+        <w:sz w:val="20"/>
+      </w:rPr>
+    </w:lvl>
+    <w:lvl w:ilvl="3" w:tentative="1">
+      <w:start w:val="1"/>
+      <w:numFmt w:val="bullet"/>
+      <w:lvlText w:val=""/>
+      <w:lvlJc w:val="left"/>
+      <w:pPr>
+        <w:tabs>
+          <w:tab w:val="num" w:pos="2880"/>
+        </w:tabs>
+        <w:ind w:left="2880" w:hanging="360"/>
+      </w:pPr>
+      <w:rPr>
+        <w:rFonts w:ascii="Wingdings" w:hAnsi="Wingdings" w:hint="default"/>
+        <w:sz w:val="20"/>
+      </w:rPr>
+    </w:lvl>
+    <w:lvl w:ilvl="4" w:tentative="1">
+      <w:start w:val="1"/>
+      <w:numFmt w:val="bullet"/>
+      <w:lvlText w:val=""/>
+      <w:lvlJc w:val="left"/>
+      <w:pPr>
+        <w:tabs>
+          <w:tab w:val="num" w:pos="3600"/>
+        </w:tabs>
+        <w:ind w:left="3600" w:hanging="360"/>
+      </w:pPr>
+      <w:rPr>
+        <w:rFonts w:ascii="Wingdings" w:hAnsi="Wingdings" w:hint="default"/>
+        <w:sz w:val="20"/>
+      </w:rPr>
+    </w:lvl>
+    <w:lvl w:ilvl="5" w:tentative="1">
+      <w:start w:val="1"/>
+      <w:numFmt w:val="bullet"/>
+      <w:lvlText w:val=""/>
+      <w:lvlJc w:val="left"/>
+      <w:pPr>
+        <w:tabs>
+          <w:tab w:val="num" w:pos="4320"/>
+        </w:tabs>
+        <w:ind w:left="4320" w:hanging="360"/>
+      </w:pPr>
+      <w:rPr>
+        <w:rFonts w:ascii="Wingdings" w:hAnsi="Wingdings" w:hint="default"/>
+        <w:sz w:val="20"/>
+      </w:rPr>
+    </w:lvl>
+    <w:lvl w:ilvl="6" w:tentative="1">
+      <w:start w:val="1"/>
+      <w:numFmt w:val="bullet"/>
+      <w:lvlText w:val=""/>
+      <w:lvlJc w:val="left"/>
+      <w:pPr>
+        <w:tabs>
+          <w:tab w:val="num" w:pos="5040"/>
+        </w:tabs>
+        <w:ind w:left="5040" w:hanging="360"/>
+      </w:pPr>
+      <w:rPr>
+        <w:rFonts w:ascii="Wingdings" w:hAnsi="Wingdings" w:hint="default"/>
+        <w:sz w:val="20"/>
+      </w:rPr>
+    </w:lvl>
+    <w:lvl w:ilvl="7" w:tentative="1">
+      <w:start w:val="1"/>
+      <w:numFmt w:val="bullet"/>
+      <w:lvlText w:val=""/>
+      <w:lvlJc w:val="left"/>
+      <w:pPr>
+        <w:tabs>
+          <w:tab w:val="num" w:pos="5760"/>
+        </w:tabs>
+        <w:ind w:left="5760" w:hanging="360"/>
+      </w:pPr>
+      <w:rPr>
+        <w:rFonts w:ascii="Wingdings" w:hAnsi="Wingdings" w:hint="default"/>
+        <w:sz w:val="20"/>
+      </w:rPr>
+    </w:lvl>
+    <w:lvl w:ilvl="8" w:tentative="1">
+      <w:start w:val="1"/>
+      <w:numFmt w:val="bullet"/>
+      <w:lvlText w:val=""/>
+      <w:lvlJc w:val="left"/>
+      <w:pPr>
+        <w:tabs>
+          <w:tab w:val="num" w:pos="6480"/>
+        </w:tabs>
+        <w:ind w:left="6480" w:hanging="360"/>
+      </w:pPr>
+      <w:rPr>
+        <w:rFonts w:ascii="Wingdings" w:hAnsi="Wingdings" w:hint="default"/>
+        <w:sz w:val="20"/>
+      </w:rPr>
+    </w:lvl>
+  </w:abstractNum>
+  <w:abstractNum w:abstractNumId="20" w15:restartNumberingAfterBreak="0">
+    <w:nsid w:val="4C5C318F"/>
+    <w:multiLevelType w:val="multilevel"/>
+    <w:tmpl w:val="E03856F6"/>
+    <w:lvl w:ilvl="0">
+      <w:start w:val="1"/>
+      <w:numFmt w:val="bullet"/>
+      <w:lvlText w:val=""/>
+      <w:lvlJc w:val="left"/>
+      <w:pPr>
+        <w:tabs>
+          <w:tab w:val="num" w:pos="720"/>
+        </w:tabs>
+        <w:ind w:left="720" w:hanging="360"/>
+      </w:pPr>
+      <w:rPr>
+        <w:rFonts w:ascii="Symbol" w:hAnsi="Symbol" w:hint="default"/>
+        <w:sz w:val="20"/>
+      </w:rPr>
+    </w:lvl>
+    <w:lvl w:ilvl="1" w:tentative="1">
+      <w:start w:val="1"/>
+      <w:numFmt w:val="bullet"/>
+      <w:lvlText w:val="o"/>
+      <w:lvlJc w:val="left"/>
+      <w:pPr>
+        <w:tabs>
+          <w:tab w:val="num" w:pos="1440"/>
+        </w:tabs>
+        <w:ind w:left="1440" w:hanging="360"/>
+      </w:pPr>
+      <w:rPr>
+        <w:rFonts w:ascii="Courier New" w:hAnsi="Courier New" w:hint="default"/>
+        <w:sz w:val="20"/>
+      </w:rPr>
+    </w:lvl>
+    <w:lvl w:ilvl="2" w:tentative="1">
+      <w:start w:val="1"/>
+      <w:numFmt w:val="bullet"/>
+      <w:lvlText w:val=""/>
+      <w:lvlJc w:val="left"/>
+      <w:pPr>
+        <w:tabs>
+          <w:tab w:val="num" w:pos="2160"/>
+        </w:tabs>
+        <w:ind w:left="2160" w:hanging="360"/>
+      </w:pPr>
+      <w:rPr>
+        <w:rFonts w:ascii="Wingdings" w:hAnsi="Wingdings" w:hint="default"/>
+        <w:sz w:val="20"/>
+      </w:rPr>
+    </w:lvl>
+    <w:lvl w:ilvl="3" w:tentative="1">
+      <w:start w:val="1"/>
+      <w:numFmt w:val="bullet"/>
+      <w:lvlText w:val=""/>
+      <w:lvlJc w:val="left"/>
+      <w:pPr>
+        <w:tabs>
+          <w:tab w:val="num" w:pos="2880"/>
+        </w:tabs>
+        <w:ind w:left="2880" w:hanging="360"/>
+      </w:pPr>
+      <w:rPr>
+        <w:rFonts w:ascii="Wingdings" w:hAnsi="Wingdings" w:hint="default"/>
+        <w:sz w:val="20"/>
+      </w:rPr>
+    </w:lvl>
+    <w:lvl w:ilvl="4" w:tentative="1">
+      <w:start w:val="1"/>
+      <w:numFmt w:val="bullet"/>
+      <w:lvlText w:val=""/>
+      <w:lvlJc w:val="left"/>
+      <w:pPr>
+        <w:tabs>
+          <w:tab w:val="num" w:pos="3600"/>
+        </w:tabs>
+        <w:ind w:left="3600" w:hanging="360"/>
+      </w:pPr>
+      <w:rPr>
+        <w:rFonts w:ascii="Wingdings" w:hAnsi="Wingdings" w:hint="default"/>
+        <w:sz w:val="20"/>
+      </w:rPr>
+    </w:lvl>
+    <w:lvl w:ilvl="5" w:tentative="1">
+      <w:start w:val="1"/>
+      <w:numFmt w:val="bullet"/>
+      <w:lvlText w:val=""/>
+      <w:lvlJc w:val="left"/>
+      <w:pPr>
+        <w:tabs>
+          <w:tab w:val="num" w:pos="4320"/>
+        </w:tabs>
+        <w:ind w:left="4320" w:hanging="360"/>
+      </w:pPr>
+      <w:rPr>
+        <w:rFonts w:ascii="Wingdings" w:hAnsi="Wingdings" w:hint="default"/>
+        <w:sz w:val="20"/>
+      </w:rPr>
+    </w:lvl>
+    <w:lvl w:ilvl="6" w:tentative="1">
+      <w:start w:val="1"/>
+      <w:numFmt w:val="bullet"/>
+      <w:lvlText w:val=""/>
+      <w:lvlJc w:val="left"/>
+      <w:pPr>
+        <w:tabs>
+          <w:tab w:val="num" w:pos="5040"/>
+        </w:tabs>
+        <w:ind w:left="5040" w:hanging="360"/>
+      </w:pPr>
+      <w:rPr>
+        <w:rFonts w:ascii="Wingdings" w:hAnsi="Wingdings" w:hint="default"/>
+        <w:sz w:val="20"/>
+      </w:rPr>
+    </w:lvl>
+    <w:lvl w:ilvl="7" w:tentative="1">
+      <w:start w:val="1"/>
+      <w:numFmt w:val="bullet"/>
+      <w:lvlText w:val=""/>
+      <w:lvlJc w:val="left"/>
+      <w:pPr>
+        <w:tabs>
+          <w:tab w:val="num" w:pos="5760"/>
+        </w:tabs>
+        <w:ind w:left="5760" w:hanging="360"/>
+      </w:pPr>
+      <w:rPr>
+        <w:rFonts w:ascii="Wingdings" w:hAnsi="Wingdings" w:hint="default"/>
+        <w:sz w:val="20"/>
+      </w:rPr>
+    </w:lvl>
+    <w:lvl w:ilvl="8" w:tentative="1">
+      <w:start w:val="1"/>
+      <w:numFmt w:val="bullet"/>
+      <w:lvlText w:val=""/>
+      <w:lvlJc w:val="left"/>
+      <w:pPr>
+        <w:tabs>
+          <w:tab w:val="num" w:pos="6480"/>
+        </w:tabs>
+        <w:ind w:left="6480" w:hanging="360"/>
+      </w:pPr>
+      <w:rPr>
+        <w:rFonts w:ascii="Wingdings" w:hAnsi="Wingdings" w:hint="default"/>
+        <w:sz w:val="20"/>
+      </w:rPr>
+    </w:lvl>
+  </w:abstractNum>
+  <w:abstractNum w:abstractNumId="21" w15:restartNumberingAfterBreak="0">
     <w:nsid w:val="580E5395"/>
     <w:multiLevelType w:val="multilevel"/>
     <w:tmpl w:val="AA32BC80"/>
@@ -5414,7 +7431,7 @@
       </w:rPr>
     </w:lvl>
   </w:abstractNum>
-  <w:abstractNum w:abstractNumId="14" w15:restartNumberingAfterBreak="0">
+  <w:abstractNum w:abstractNumId="22" w15:restartNumberingAfterBreak="0">
     <w:nsid w:val="595675A9"/>
     <w:multiLevelType w:val="multilevel"/>
     <w:tmpl w:val="66A8A13A"/>
@@ -5563,7 +7580,7 @@
       </w:rPr>
     </w:lvl>
   </w:abstractNum>
-  <w:abstractNum w:abstractNumId="15" w15:restartNumberingAfterBreak="0">
+  <w:abstractNum w:abstractNumId="23" w15:restartNumberingAfterBreak="0">
     <w:nsid w:val="5F557B96"/>
     <w:multiLevelType w:val="multilevel"/>
     <w:tmpl w:val="085C2EC8"/>
@@ -5712,7 +7729,7 @@
       </w:rPr>
     </w:lvl>
   </w:abstractNum>
-  <w:abstractNum w:abstractNumId="16" w15:restartNumberingAfterBreak="0">
+  <w:abstractNum w:abstractNumId="24" w15:restartNumberingAfterBreak="0">
     <w:nsid w:val="69EA0BF2"/>
     <w:multiLevelType w:val="multilevel"/>
     <w:tmpl w:val="F030F246"/>
@@ -5861,7 +7878,7 @@
       </w:rPr>
     </w:lvl>
   </w:abstractNum>
-  <w:abstractNum w:abstractNumId="17" w15:restartNumberingAfterBreak="0">
+  <w:abstractNum w:abstractNumId="25" w15:restartNumberingAfterBreak="0">
     <w:nsid w:val="71B62459"/>
     <w:multiLevelType w:val="multilevel"/>
     <w:tmpl w:val="692AEE0C"/>
@@ -6010,7 +8027,7 @@
       </w:rPr>
     </w:lvl>
   </w:abstractNum>
-  <w:abstractNum w:abstractNumId="18" w15:restartNumberingAfterBreak="0">
+  <w:abstractNum w:abstractNumId="26" w15:restartNumberingAfterBreak="0">
     <w:nsid w:val="734D23A7"/>
     <w:multiLevelType w:val="multilevel"/>
     <w:tmpl w:val="F63C1B54"/>
@@ -6159,7 +8176,7 @@
       </w:rPr>
     </w:lvl>
   </w:abstractNum>
-  <w:abstractNum w:abstractNumId="19" w15:restartNumberingAfterBreak="0">
+  <w:abstractNum w:abstractNumId="27" w15:restartNumberingAfterBreak="0">
     <w:nsid w:val="7A6D06B8"/>
     <w:multiLevelType w:val="multilevel"/>
     <w:tmpl w:val="F77841F6"/>
@@ -6308,7 +8325,7 @@
       </w:rPr>
     </w:lvl>
   </w:abstractNum>
-  <w:abstractNum w:abstractNumId="20" w15:restartNumberingAfterBreak="0">
+  <w:abstractNum w:abstractNumId="28" w15:restartNumberingAfterBreak="0">
     <w:nsid w:val="7AC11ABE"/>
     <w:multiLevelType w:val="multilevel"/>
     <w:tmpl w:val="4404C486"/>
@@ -6457,7 +8474,7 @@
       </w:rPr>
     </w:lvl>
   </w:abstractNum>
-  <w:abstractNum w:abstractNumId="21" w15:restartNumberingAfterBreak="0">
+  <w:abstractNum w:abstractNumId="29" w15:restartNumberingAfterBreak="0">
     <w:nsid w:val="7DC23CFB"/>
     <w:multiLevelType w:val="multilevel"/>
     <w:tmpl w:val="3A7E7016"/>
@@ -6607,70 +8624,94 @@
     </w:lvl>
   </w:abstractNum>
   <w:num w:numId="1" w16cid:durableId="1845588823">
-    <w:abstractNumId w:val="12"/>
+    <w:abstractNumId w:val="18"/>
   </w:num>
   <w:num w:numId="2" w16cid:durableId="1881433307">
     <w:abstractNumId w:val="3"/>
   </w:num>
   <w:num w:numId="3" w16cid:durableId="732583315">
-    <w:abstractNumId w:val="21"/>
+    <w:abstractNumId w:val="29"/>
   </w:num>
   <w:num w:numId="4" w16cid:durableId="277026292">
-    <w:abstractNumId w:val="5"/>
+    <w:abstractNumId w:val="9"/>
   </w:num>
   <w:num w:numId="5" w16cid:durableId="1280841014">
-    <w:abstractNumId w:val="14"/>
+    <w:abstractNumId w:val="22"/>
   </w:num>
   <w:num w:numId="6" w16cid:durableId="2066635691">
-    <w:abstractNumId w:val="20"/>
+    <w:abstractNumId w:val="28"/>
   </w:num>
   <w:num w:numId="7" w16cid:durableId="45185695">
-    <w:abstractNumId w:val="19"/>
+    <w:abstractNumId w:val="27"/>
   </w:num>
   <w:num w:numId="8" w16cid:durableId="245844787">
     <w:abstractNumId w:val="1"/>
   </w:num>
   <w:num w:numId="9" w16cid:durableId="784690539">
-    <w:abstractNumId w:val="7"/>
+    <w:abstractNumId w:val="11"/>
   </w:num>
   <w:num w:numId="10" w16cid:durableId="1888757371">
-    <w:abstractNumId w:val="18"/>
+    <w:abstractNumId w:val="26"/>
   </w:num>
   <w:num w:numId="11" w16cid:durableId="228736853">
-    <w:abstractNumId w:val="16"/>
+    <w:abstractNumId w:val="24"/>
   </w:num>
   <w:num w:numId="12" w16cid:durableId="1274245891">
-    <w:abstractNumId w:val="8"/>
+    <w:abstractNumId w:val="12"/>
   </w:num>
   <w:num w:numId="13" w16cid:durableId="1228876381">
     <w:abstractNumId w:val="0"/>
   </w:num>
   <w:num w:numId="14" w16cid:durableId="2076925479">
-    <w:abstractNumId w:val="4"/>
+    <w:abstractNumId w:val="5"/>
   </w:num>
   <w:num w:numId="15" w16cid:durableId="783646715">
-    <w:abstractNumId w:val="13"/>
+    <w:abstractNumId w:val="21"/>
   </w:num>
   <w:num w:numId="16" w16cid:durableId="1385324363">
     <w:abstractNumId w:val="2"/>
   </w:num>
   <w:num w:numId="17" w16cid:durableId="1846246065">
+    <w:abstractNumId w:val="25"/>
+  </w:num>
+  <w:num w:numId="18" w16cid:durableId="323510495">
+    <w:abstractNumId w:val="15"/>
+  </w:num>
+  <w:num w:numId="19" w16cid:durableId="1195926113">
+    <w:abstractNumId w:val="16"/>
+  </w:num>
+  <w:num w:numId="20" w16cid:durableId="1343699018">
     <w:abstractNumId w:val="17"/>
   </w:num>
-  <w:num w:numId="18" w16cid:durableId="323510495">
-    <w:abstractNumId w:val="9"/>
-  </w:num>
-  <w:num w:numId="19" w16cid:durableId="1195926113">
+  <w:num w:numId="21" w16cid:durableId="1722706943">
     <w:abstractNumId w:val="10"/>
   </w:num>
-  <w:num w:numId="20" w16cid:durableId="1343699018">
-    <w:abstractNumId w:val="11"/>
+  <w:num w:numId="22" w16cid:durableId="380128483">
+    <w:abstractNumId w:val="23"/>
   </w:num>
-  <w:num w:numId="21" w16cid:durableId="1722706943">
+  <w:num w:numId="23" w16cid:durableId="78722359">
     <w:abstractNumId w:val="6"/>
   </w:num>
-  <w:num w:numId="22" w16cid:durableId="380128483">
-    <w:abstractNumId w:val="15"/>
+  <w:num w:numId="24" w16cid:durableId="1152454307">
+    <w:abstractNumId w:val="20"/>
+  </w:num>
+  <w:num w:numId="25" w16cid:durableId="1524779593">
+    <w:abstractNumId w:val="14"/>
+  </w:num>
+  <w:num w:numId="26" w16cid:durableId="942297340">
+    <w:abstractNumId w:val="8"/>
+  </w:num>
+  <w:num w:numId="27" w16cid:durableId="637496442">
+    <w:abstractNumId w:val="7"/>
+  </w:num>
+  <w:num w:numId="28" w16cid:durableId="221672787">
+    <w:abstractNumId w:val="19"/>
+  </w:num>
+  <w:num w:numId="29" w16cid:durableId="1271743112">
+    <w:abstractNumId w:val="13"/>
+  </w:num>
+  <w:num w:numId="30" w16cid:durableId="281302133">
+    <w:abstractNumId w:val="4"/>
   </w:num>
 </w:numbering>
 </file>
@@ -7278,7 +9319,6 @@
   <w:style w:type="character" w:default="1" w:styleId="DefaultParagraphFont">
     <w:name w:val="Default Paragraph Font"/>
     <w:uiPriority w:val="1"/>
-    <w:semiHidden/>
     <w:unhideWhenUsed/>
   </w:style>
   <w:style w:type="table" w:default="1" w:styleId="TableNormal">

</xml_diff>